<commit_message>
test: complete final accessibility and delivery audit
</commit_message>
<xml_diff>
--- a/academic/submissions/01_Literature_Data_Technology_Submission.docx
+++ b/academic/submissions/01_Literature_Data_Technology_Submission.docx
@@ -36,7 +36,8 @@
     </w:p>
     <w:p>
       <w:pPr>
-        <w:spacing w:after="40"/>
+        <w:keepLines/>
+        <w:spacing w:after="60" w:line="276" w:lineRule="auto"/>
       </w:pPr>
       <w:r>
         <w:rPr>
@@ -58,7 +59,8 @@
     </w:p>
     <w:p>
       <w:pPr>
-        <w:spacing w:after="40"/>
+        <w:keepLines/>
+        <w:spacing w:after="60" w:line="276" w:lineRule="auto"/>
       </w:pPr>
       <w:r>
         <w:rPr>
@@ -80,7 +82,8 @@
     </w:p>
     <w:p>
       <w:pPr>
-        <w:spacing w:after="40"/>
+        <w:keepLines/>
+        <w:spacing w:after="60" w:line="276" w:lineRule="auto"/>
       </w:pPr>
       <w:r>
         <w:rPr>
@@ -102,7 +105,8 @@
     </w:p>
     <w:p>
       <w:pPr>
-        <w:spacing w:after="40"/>
+        <w:keepLines/>
+        <w:spacing w:after="60" w:line="276" w:lineRule="auto"/>
       </w:pPr>
       <w:r>
         <w:rPr>
@@ -124,7 +128,8 @@
     </w:p>
     <w:p>
       <w:pPr>
-        <w:spacing w:after="40"/>
+        <w:keepLines/>
+        <w:spacing w:after="60" w:line="276" w:lineRule="auto"/>
       </w:pPr>
       <w:r>
         <w:rPr>
@@ -146,7 +151,8 @@
     </w:p>
     <w:p>
       <w:pPr>
-        <w:spacing w:after="40"/>
+        <w:keepLines/>
+        <w:spacing w:after="60" w:line="276" w:lineRule="auto"/>
       </w:pPr>
       <w:r>
         <w:rPr>
@@ -177,7 +183,7 @@
     <w:p>
       <w:pPr>
         <w:shd w:fill="E8F1ED"/>
-        <w:spacing w:before="80" w:after="0"/>
+        <w:spacing w:before="80" w:after="160"/>
         <w:ind w:left="115" w:right="115"/>
       </w:pPr>
       <w:r>
@@ -305,6 +311,7 @@
       <w:tr>
         <w:trPr>
           <w:tblHeader w:val="true"/>
+          <w:cantSplit w:val="true"/>
         </w:trPr>
         <w:tc>
           <w:tcPr>
@@ -416,6 +423,9 @@
         </w:tc>
       </w:tr>
       <w:tr>
+        <w:trPr>
+          <w:cantSplit w:val="true"/>
+        </w:trPr>
         <w:tc>
           <w:tcPr>
             <w:tcW w:type="dxa" w:w="1450"/>
@@ -494,6 +504,9 @@
         </w:tc>
       </w:tr>
       <w:tr>
+        <w:trPr>
+          <w:cantSplit w:val="true"/>
+        </w:trPr>
         <w:tc>
           <w:tcPr>
             <w:tcW w:type="dxa" w:w="1450"/>
@@ -572,6 +585,9 @@
         </w:tc>
       </w:tr>
       <w:tr>
+        <w:trPr>
+          <w:cantSplit w:val="true"/>
+        </w:trPr>
         <w:tc>
           <w:tcPr>
             <w:tcW w:type="dxa" w:w="1450"/>
@@ -650,6 +666,9 @@
         </w:tc>
       </w:tr>
       <w:tr>
+        <w:trPr>
+          <w:cantSplit w:val="true"/>
+        </w:trPr>
         <w:tc>
           <w:tcPr>
             <w:tcW w:type="dxa" w:w="1450"/>
@@ -728,6 +747,9 @@
         </w:tc>
       </w:tr>
       <w:tr>
+        <w:trPr>
+          <w:cantSplit w:val="true"/>
+        </w:trPr>
         <w:tc>
           <w:tcPr>
             <w:tcW w:type="dxa" w:w="1450"/>
@@ -898,6 +920,7 @@
       <w:tr>
         <w:trPr>
           <w:tblHeader w:val="true"/>
+          <w:cantSplit w:val="true"/>
         </w:trPr>
         <w:tc>
           <w:tcPr>
@@ -1009,6 +1032,9 @@
         </w:tc>
       </w:tr>
       <w:tr>
+        <w:trPr>
+          <w:cantSplit w:val="true"/>
+        </w:trPr>
         <w:tc>
           <w:tcPr>
             <w:tcW w:type="dxa" w:w="1900"/>
@@ -1087,6 +1113,9 @@
         </w:tc>
       </w:tr>
       <w:tr>
+        <w:trPr>
+          <w:cantSplit w:val="true"/>
+        </w:trPr>
         <w:tc>
           <w:tcPr>
             <w:tcW w:type="dxa" w:w="1900"/>
@@ -1165,6 +1194,9 @@
         </w:tc>
       </w:tr>
       <w:tr>
+        <w:trPr>
+          <w:cantSplit w:val="true"/>
+        </w:trPr>
         <w:tc>
           <w:tcPr>
             <w:tcW w:type="dxa" w:w="1900"/>
@@ -1286,6 +1318,7 @@
       <w:tr>
         <w:trPr>
           <w:tblHeader w:val="true"/>
+          <w:cantSplit w:val="true"/>
         </w:trPr>
         <w:tc>
           <w:tcPr>
@@ -1343,6 +1376,9 @@
         </w:tc>
       </w:tr>
       <w:tr>
+        <w:trPr>
+          <w:cantSplit w:val="true"/>
+        </w:trPr>
         <w:tc>
           <w:tcPr>
             <w:tcW w:type="dxa" w:w="2500"/>
@@ -1383,6 +1419,9 @@
         </w:tc>
       </w:tr>
       <w:tr>
+        <w:trPr>
+          <w:cantSplit w:val="true"/>
+        </w:trPr>
         <w:tc>
           <w:tcPr>
             <w:tcW w:type="dxa" w:w="2500"/>
@@ -1423,6 +1462,9 @@
         </w:tc>
       </w:tr>
       <w:tr>
+        <w:trPr>
+          <w:cantSplit w:val="true"/>
+        </w:trPr>
         <w:tc>
           <w:tcPr>
             <w:tcW w:type="dxa" w:w="2500"/>
@@ -1463,6 +1505,9 @@
         </w:tc>
       </w:tr>
       <w:tr>
+        <w:trPr>
+          <w:cantSplit w:val="true"/>
+        </w:trPr>
         <w:tc>
           <w:tcPr>
             <w:tcW w:type="dxa" w:w="2500"/>
@@ -1503,6 +1548,9 @@
         </w:tc>
       </w:tr>
       <w:tr>
+        <w:trPr>
+          <w:cantSplit w:val="true"/>
+        </w:trPr>
         <w:tc>
           <w:tcPr>
             <w:tcW w:type="dxa" w:w="2500"/>
@@ -1543,6 +1591,9 @@
         </w:tc>
       </w:tr>
       <w:tr>
+        <w:trPr>
+          <w:cantSplit w:val="true"/>
+        </w:trPr>
         <w:tc>
           <w:tcPr>
             <w:tcW w:type="dxa" w:w="2500"/>
@@ -1583,6 +1634,9 @@
         </w:tc>
       </w:tr>
       <w:tr>
+        <w:trPr>
+          <w:cantSplit w:val="true"/>
+        </w:trPr>
         <w:tc>
           <w:tcPr>
             <w:tcW w:type="dxa" w:w="2500"/>
@@ -1865,6 +1919,7 @@
       <w:tr>
         <w:trPr>
           <w:tblHeader w:val="true"/>
+          <w:cantSplit w:val="true"/>
         </w:trPr>
         <w:tc>
           <w:tcPr>
@@ -1976,6 +2031,9 @@
         </w:tc>
       </w:tr>
       <w:tr>
+        <w:trPr>
+          <w:cantSplit w:val="true"/>
+        </w:trPr>
         <w:tc>
           <w:tcPr>
             <w:tcW w:type="dxa" w:w="1300"/>
@@ -2054,6 +2112,9 @@
         </w:tc>
       </w:tr>
       <w:tr>
+        <w:trPr>
+          <w:cantSplit w:val="true"/>
+        </w:trPr>
         <w:tc>
           <w:tcPr>
             <w:tcW w:type="dxa" w:w="1300"/>
@@ -2132,6 +2193,9 @@
         </w:tc>
       </w:tr>
       <w:tr>
+        <w:trPr>
+          <w:cantSplit w:val="true"/>
+        </w:trPr>
         <w:tc>
           <w:tcPr>
             <w:tcW w:type="dxa" w:w="1300"/>
@@ -2204,12 +2268,15 @@
                 <w:color w:val="000000"/>
                 <w:sz w:val="18"/>
               </w:rPr>
-              <w:t>Browser QA and accessibility require deployment-like validation</w:t>
+              <w:t>Automated desktop/mobile Chromium and Axe checks pass; manual multi-browser and assistive-technology review remains external</w:t>
             </w:r>
           </w:p>
         </w:tc>
       </w:tr>
       <w:tr>
+        <w:trPr>
+          <w:cantSplit w:val="true"/>
+        </w:trPr>
         <w:tc>
           <w:tcPr>
             <w:tcW w:type="dxa" w:w="1300"/>
@@ -2288,6 +2355,9 @@
         </w:tc>
       </w:tr>
       <w:tr>
+        <w:trPr>
+          <w:cantSplit w:val="true"/>
+        </w:trPr>
         <w:tc>
           <w:tcPr>
             <w:tcW w:type="dxa" w:w="1300"/>
@@ -2366,6 +2436,9 @@
         </w:tc>
       </w:tr>
       <w:tr>
+        <w:trPr>
+          <w:cantSplit w:val="true"/>
+        </w:trPr>
         <w:tc>
           <w:tcPr>
             <w:tcW w:type="dxa" w:w="1300"/>
@@ -2444,6 +2517,9 @@
         </w:tc>
       </w:tr>
       <w:tr>
+        <w:trPr>
+          <w:cantSplit w:val="true"/>
+        </w:trPr>
         <w:tc>
           <w:tcPr>
             <w:tcW w:type="dxa" w:w="1300"/>
@@ -2522,6 +2598,9 @@
         </w:tc>
       </w:tr>
       <w:tr>
+        <w:trPr>
+          <w:cantSplit w:val="true"/>
+        </w:trPr>
         <w:tc>
           <w:tcPr>
             <w:tcW w:type="dxa" w:w="1300"/>
@@ -2669,7 +2748,7 @@
     </w:p>
     <w:p>
       <w:r>
-        <w:t>No live Meta, Google Ads, OIDC, LLM or cloud credentials were supplied; these boundaries are implemented and mock-tested but not live-validated. The local MLflow registry and single historical dataset do not establish production robustness. Next work after review should include credentialed sandbox validation, load/resilience tests, accessibility/browser review, managed backup/restore rehearsal and monitoring thresholds based on real operating data.</w:t>
+        <w:t>No live Meta, Google Ads, OIDC, LLM or cloud credentials were supplied; these boundaries are implemented and mock-tested but not live-validated. The local MLflow registry and single historical dataset do not establish production robustness. Next work after review should include credentialed sandbox validation, load/resilience tests, manual multi-browser and assistive-technology review, managed backup/restore rehearsal and monitoring thresholds based on real operating data.</w:t>
       </w:r>
     </w:p>
     <w:p>

</xml_diff>

<commit_message>
docs: complete final assignment audit
</commit_message>
<xml_diff>
--- a/academic/submissions/01_Literature_Data_Technology_Submission.docx
+++ b/academic/submissions/01_Literature_Data_Technology_Submission.docx
@@ -2703,7 +2703,265 @@
         <w:pStyle w:val="Heading2"/>
       </w:pPr>
       <w:r>
-        <w:t>3. Use cases</w:t>
+        <w:t>3. Industry examples and project use cases</w:t>
+      </w:r>
+    </w:p>
+    <w:p>
+      <w:r>
+        <w:t>The following external-source examples show how established platforms place machine learning inside marketing operations. They document product capabilities, not outcomes achieved by GrowthPilot.</w:t>
+      </w:r>
+    </w:p>
+    <w:tbl>
+      <w:tblPr>
+        <w:tblStyle w:val="TableGrid"/>
+        <w:tblW w:type="dxa" w:w="9360"/>
+        <w:jc w:val="left"/>
+        <w:tblLayout w:type="fixed"/>
+        <w:tblLook w:firstColumn="1" w:firstRow="1" w:lastColumn="0" w:lastRow="0" w:noHBand="0" w:noVBand="1" w:val="04A0"/>
+        <w:tblInd w:w="120" w:type="dxa"/>
+      </w:tblPr>
+      <w:tblGrid>
+        <w:gridCol w:w="1800"/>
+        <w:gridCol w:w="3700"/>
+        <w:gridCol w:w="3860"/>
+      </w:tblGrid>
+      <w:tr>
+        <w:trPr>
+          <w:tblHeader w:val="true"/>
+          <w:cantSplit w:val="true"/>
+        </w:trPr>
+        <w:tc>
+          <w:tcPr>
+            <w:tcW w:type="dxa" w:w="1800"/>
+            <w:tcMar>
+              <w:top w:w="80" w:type="dxa"/>
+              <w:start w:w="120" w:type="dxa"/>
+              <w:bottom w:w="80" w:type="dxa"/>
+              <w:end w:w="120" w:type="dxa"/>
+            </w:tcMar>
+            <w:shd w:fill="F2F4F7"/>
+            <w:vAlign w:val="center"/>
+          </w:tcPr>
+          <w:p>
+            <w:pPr>
+              <w:spacing w:after="0"/>
+            </w:pPr>
+            <w:r>
+              <w:rPr>
+                <w:rFonts w:ascii="Calibri" w:hAnsi="Calibri"/>
+                <w:b/>
+                <w:color w:val="173B32"/>
+                <w:sz w:val="19"/>
+              </w:rPr>
+              <w:t>External product</w:t>
+            </w:r>
+          </w:p>
+        </w:tc>
+        <w:tc>
+          <w:tcPr>
+            <w:tcW w:type="dxa" w:w="3700"/>
+            <w:tcMar>
+              <w:top w:w="80" w:type="dxa"/>
+              <w:start w:w="120" w:type="dxa"/>
+              <w:bottom w:w="80" w:type="dxa"/>
+              <w:end w:w="120" w:type="dxa"/>
+            </w:tcMar>
+            <w:shd w:fill="F2F4F7"/>
+            <w:vAlign w:val="center"/>
+          </w:tcPr>
+          <w:p>
+            <w:pPr>
+              <w:spacing w:after="0"/>
+            </w:pPr>
+            <w:r>
+              <w:rPr>
+                <w:rFonts w:ascii="Calibri" w:hAnsi="Calibri"/>
+                <w:b/>
+                <w:color w:val="173B32"/>
+                <w:sz w:val="19"/>
+              </w:rPr>
+              <w:t>Marketing use / evidence</w:t>
+            </w:r>
+          </w:p>
+        </w:tc>
+        <w:tc>
+          <w:tcPr>
+            <w:tcW w:type="dxa" w:w="3860"/>
+            <w:tcMar>
+              <w:top w:w="80" w:type="dxa"/>
+              <w:start w:w="120" w:type="dxa"/>
+              <w:bottom w:w="80" w:type="dxa"/>
+              <w:end w:w="120" w:type="dxa"/>
+            </w:tcMar>
+            <w:shd w:fill="F2F4F7"/>
+            <w:vAlign w:val="center"/>
+          </w:tcPr>
+          <w:p>
+            <w:pPr>
+              <w:spacing w:after="0"/>
+            </w:pPr>
+            <w:r>
+              <w:rPr>
+                <w:rFonts w:ascii="Calibri" w:hAnsi="Calibri"/>
+                <w:b/>
+                <w:color w:val="173B32"/>
+                <w:sz w:val="19"/>
+              </w:rPr>
+              <w:t>Lesson for GrowthPilot</w:t>
+            </w:r>
+          </w:p>
+        </w:tc>
+      </w:tr>
+      <w:tr>
+        <w:trPr>
+          <w:cantSplit w:val="true"/>
+        </w:trPr>
+        <w:tc>
+          <w:tcPr>
+            <w:tcW w:type="dxa" w:w="1800"/>
+            <w:vAlign w:val="top"/>
+          </w:tcPr>
+          <w:p>
+            <w:pPr>
+              <w:spacing w:after="0"/>
+            </w:pPr>
+            <w:r>
+              <w:rPr>
+                <w:rFonts w:ascii="Calibri" w:hAnsi="Calibri"/>
+                <w:color w:val="000000"/>
+                <w:sz w:val="18"/>
+              </w:rPr>
+              <w:t>Salesforce Einstein Lead Scoring</w:t>
+            </w:r>
+          </w:p>
+        </w:tc>
+        <w:tc>
+          <w:tcPr>
+            <w:tcW w:type="dxa" w:w="3700"/>
+            <w:vAlign w:val="top"/>
+          </w:tcPr>
+          <w:p>
+            <w:pPr>
+              <w:spacing w:after="0"/>
+            </w:pPr>
+            <w:r>
+              <w:rPr>
+                <w:rFonts w:ascii="Calibri" w:hAnsi="Calibri"/>
+                <w:color w:val="000000"/>
+                <w:sz w:val="18"/>
+              </w:rPr>
+              <w:t>Analyzes historical lead-conversion patterns to prioritize current leads and exposes influential fields in CRM views.</w:t>
+            </w:r>
+          </w:p>
+        </w:tc>
+        <w:tc>
+          <w:tcPr>
+            <w:tcW w:type="dxa" w:w="3860"/>
+            <w:vAlign w:val="top"/>
+          </w:tcPr>
+          <w:p>
+            <w:pPr>
+              <w:spacing w:after="0"/>
+            </w:pPr>
+            <w:r>
+              <w:rPr>
+                <w:rFonts w:ascii="Calibri" w:hAnsi="Calibri"/>
+                <w:color w:val="000000"/>
+                <w:sz w:val="18"/>
+              </w:rPr>
+              <w:t>A score becomes operationally useful when it appears in the user's workflow with an explanation; vendor capability is not GrowthPilot outcome evidence.</w:t>
+            </w:r>
+          </w:p>
+        </w:tc>
+      </w:tr>
+      <w:tr>
+        <w:trPr>
+          <w:cantSplit w:val="true"/>
+        </w:trPr>
+        <w:tc>
+          <w:tcPr>
+            <w:tcW w:type="dxa" w:w="1800"/>
+            <w:vAlign w:val="top"/>
+          </w:tcPr>
+          <w:p>
+            <w:pPr>
+              <w:spacing w:after="0"/>
+            </w:pPr>
+            <w:r>
+              <w:rPr>
+                <w:rFonts w:ascii="Calibri" w:hAnsi="Calibri"/>
+                <w:color w:val="000000"/>
+                <w:sz w:val="18"/>
+              </w:rPr>
+              <w:t>Google Ads Smart Bidding</w:t>
+            </w:r>
+          </w:p>
+        </w:tc>
+        <w:tc>
+          <w:tcPr>
+            <w:tcW w:type="dxa" w:w="3700"/>
+            <w:vAlign w:val="top"/>
+          </w:tcPr>
+          <w:p>
+            <w:pPr>
+              <w:spacing w:after="0"/>
+            </w:pPr>
+            <w:r>
+              <w:rPr>
+                <w:rFonts w:ascii="Calibri" w:hAnsi="Calibri"/>
+                <w:color w:val="000000"/>
+                <w:sz w:val="18"/>
+              </w:rPr>
+              <w:t>Uses Google AI for auction-time bidding toward conversions or conversion value; it depends on conversion tracking and may depend on historical conversion volume.</w:t>
+            </w:r>
+          </w:p>
+        </w:tc>
+        <w:tc>
+          <w:tcPr>
+            <w:tcW w:type="dxa" w:w="3860"/>
+            <w:vAlign w:val="top"/>
+          </w:tcPr>
+          <w:p>
+            <w:pPr>
+              <w:spacing w:after="0"/>
+            </w:pPr>
+            <w:r>
+              <w:rPr>
+                <w:rFonts w:ascii="Calibri" w:hAnsi="Calibri"/>
+                <w:color w:val="000000"/>
+                <w:sz w:val="18"/>
+              </w:rPr>
+              <w:t>Optimization quality depends on measurement and provider data. GrowthPilot therefore keeps provider execution separate from first-party decision governance.</w:t>
+            </w:r>
+          </w:p>
+        </w:tc>
+      </w:tr>
+    </w:tbl>
+    <w:p>
+      <w:pPr>
+        <w:spacing w:after="40"/>
+      </w:pPr>
+    </w:p>
+    <w:p>
+      <w:pPr>
+        <w:spacing w:before="80" w:after="80"/>
+      </w:pPr>
+      <w:r>
+        <w:rPr>
+          <w:rFonts w:ascii="Calibri" w:hAnsi="Calibri"/>
+          <w:i/>
+          <w:color w:val="547068"/>
+          <w:sz w:val="17"/>
+        </w:rPr>
+        <w:t>External-source capability examples. No vendor performance claim or GrowthPilot business outcome is asserted.</w:t>
+      </w:r>
+    </w:p>
+    <w:p>
+      <w:pPr>
+        <w:pStyle w:val="Heading3"/>
+      </w:pPr>
+      <w:r>
+        <w:t>GrowthPilot application</w:t>
       </w:r>
     </w:p>
     <w:p>
@@ -2800,6 +3058,16 @@
     <w:p>
       <w:r>
         <w:t>Saito, T., &amp; Rehmsmeier, M. (2015). The precision-recall plot is more informative than the ROC plot when evaluating binary classifiers on imbalanced datasets. PLOS ONE, 10(3), e0118432. https://doi.org/10.1371/journal.pone.0118432</w:t>
+      </w:r>
+    </w:p>
+    <w:p>
+      <w:r>
+        <w:t>Salesforce. (n.d.). Einstein Lead Scoring. Salesforce Help. https://help.salesforce.com/s/articleView?id=einstein_sales_lead_insights.htm&amp;language=en_US. Accessed 11 September 2026.</w:t>
+      </w:r>
+    </w:p>
+    <w:p>
+      <w:r>
+        <w:t>Google Ads Help. (n.d.). About Smart Bidding. https://support.google.com/google-ads/answer/7065882?hl=en. Accessed 11 September 2026.</w:t>
       </w:r>
     </w:p>
     <w:p>

</xml_diff>

<commit_message>
docs: publish Turkish academic deliverables
</commit_message>
<xml_diff>
--- a/academic/submissions/01_Literature_Data_Technology_Submission.docx
+++ b/academic/submissions/01_Literature_Data_Technology_Submission.docx
@@ -18,7 +18,7 @@
           <w:color w:val="173B32"/>
           <w:sz w:val="46"/>
         </w:rPr>
-        <w:t>Literature, Data and Technology Submission</w:t>
+        <w:t>Literatür, Veri ve Teknoloji Çalışması</w:t>
       </w:r>
     </w:p>
     <w:p>
@@ -31,7 +31,7 @@
           <w:color w:val="547068"/>
           <w:sz w:val="27"/>
         </w:rPr>
-        <w:t>Evidence-led research foundation for a governed retail churn decision system</w:t>
+        <w:t>Denetimli bir perakende müşteri kaybı karar sistemi için kanıta dayalı araştırma temeli</w:t>
       </w:r>
     </w:p>
     <w:p>
@@ -46,7 +46,7 @@
           <w:color w:val="173B32"/>
           <w:sz w:val="21"/>
         </w:rPr>
-        <w:t xml:space="preserve">Course: </w:t>
+        <w:t xml:space="preserve">Ders: </w:t>
       </w:r>
       <w:r>
         <w:rPr>
@@ -54,7 +54,7 @@
           <w:color w:val="000000"/>
           <w:sz w:val="21"/>
         </w:rPr>
-        <w:t>Samsung Innovation Campus — AI in Marketing Capstone</w:t>
+        <w:t>Samsung Innovation Campus — Pazarlamada Yapay Zekâ Bitirme Projesi</w:t>
       </w:r>
     </w:p>
     <w:p>
@@ -69,7 +69,7 @@
           <w:color w:val="173B32"/>
           <w:sz w:val="21"/>
         </w:rPr>
-        <w:t xml:space="preserve">Team: </w:t>
+        <w:t xml:space="preserve">Ekip: </w:t>
       </w:r>
       <w:r>
         <w:rPr>
@@ -77,7 +77,7 @@
           <w:color w:val="000000"/>
           <w:sz w:val="21"/>
         </w:rPr>
-        <w:t>Group 7</w:t>
+        <w:t>Grup 7</w:t>
       </w:r>
     </w:p>
     <w:p>
@@ -92,7 +92,7 @@
           <w:color w:val="173B32"/>
           <w:sz w:val="21"/>
         </w:rPr>
-        <w:t xml:space="preserve">Project: </w:t>
+        <w:t xml:space="preserve">Proje: </w:t>
       </w:r>
       <w:r>
         <w:rPr>
@@ -115,7 +115,7 @@
           <w:color w:val="173B32"/>
           <w:sz w:val="21"/>
         </w:rPr>
-        <w:t xml:space="preserve">Prepared by: </w:t>
+        <w:t xml:space="preserve">Hazırlayan: </w:t>
       </w:r>
       <w:r>
         <w:rPr>
@@ -138,7 +138,7 @@
           <w:color w:val="173B32"/>
           <w:sz w:val="21"/>
         </w:rPr>
-        <w:t xml:space="preserve">Date: </w:t>
+        <w:t xml:space="preserve">Tarih: </w:t>
       </w:r>
       <w:r>
         <w:rPr>
@@ -146,7 +146,7 @@
           <w:color w:val="000000"/>
           <w:sz w:val="21"/>
         </w:rPr>
-        <w:t>9 September 2026</w:t>
+        <w:t>9 Eylül 2026</w:t>
       </w:r>
     </w:p>
     <w:p>
@@ -161,7 +161,7 @@
           <w:color w:val="173B32"/>
           <w:sz w:val="21"/>
         </w:rPr>
-        <w:t xml:space="preserve">Status: </w:t>
+        <w:t xml:space="preserve">Durum: </w:t>
       </w:r>
       <w:r>
         <w:rPr>
@@ -169,7 +169,7 @@
           <w:color w:val="000000"/>
           <w:sz w:val="21"/>
         </w:rPr>
-        <w:t>Final local academic package</w:t>
+        <w:t>Nihai yerel akademik paket</w:t>
       </w:r>
     </w:p>
     <w:p>
@@ -193,7 +193,7 @@
           <w:color w:val="173B32"/>
           <w:sz w:val="19"/>
         </w:rPr>
-        <w:t>AI AUTHORSHIP DISCLOSURE — This document was drafted with OpenAI Codex/ChatGPT assistance and checked against repository evidence. Reported project metrics come from executed, versioned artifacts; external claims are cited. Human review remains required.</w:t>
+        <w:t>YAPAY ZEKA KULLANIM BEYANI — Bu belge OpenAI Codex/ChatGPT desteğiyle hazırlanmış ve depo kanıtlarıyla kontrol edilmiştir. Proje ölçütleri yürütülmüş, sürümlenmiş eserlerden gelir; dış iddialar kaynaklandırılmıştır. İnsan incelemesi gereklidir.</w:t>
       </w:r>
     </w:p>
     <w:p/>
@@ -202,17 +202,17 @@
         <w:pStyle w:val="Heading1"/>
       </w:pPr>
       <w:r>
-        <w:t>Executive summary</w:t>
+        <w:t>Yönetici özeti</w:t>
       </w:r>
     </w:p>
     <w:p>
       <w:r>
-        <w:t>GrowthPilot AI addresses a practical marketing problem: small retail teams hold customer, order, product, inventory and advertising information in disconnected tools, so retention decisions are late, difficult to explain and hard to audit. The capstone narrows the first supervised-learning problem to future-purchase inactivity in a non-contractual retail setting. This is a prediction problem, not proof that a customer has permanently churned and not evidence that an intervention causes retention.</w:t>
+        <w:t>GrowthPilot AI, küçük perakende ekiplerindeki dağınık müşteri, sipariş, ürün, stok ve reklam verilerini birleştirerek geç, açıklanması güç ve denetlenemeyen müşteriyi elde tutma kararlarını iyileştirmeyi amaçlar. İlk denetimli öğrenme problemi, sözleşmesiz perakendede 90 günlük gelecekte satın alma hareketsizliğidir. Bu bir tahmindir; kalıcı müşteri kaybını veya bir müdahalenin nedensel etkisini kanıtlamaz.</w:t>
       </w:r>
     </w:p>
     <w:p>
       <w:r>
-        <w:t>The research synthesis supports four methodological choices: define the outcome operationally; use chronological observation and outcome windows; compare a transparent baseline and logistic model before complex learners; and evaluate probability quality plus capacity-constrained ranking rather than accuracy alone. UCI Online Retail II was selected because its two-year transaction history supports temporal snapshots. The implemented technology stack keeps data provenance, tenant isolation, model versioning, consent and human approval inside one auditable workflow.</w:t>
+        <w:t>Araştırma dört yöntemi destekler: sonucu operasyonel tanımlamak, kronolojik gözlem/sonuç pencereleri kullanmak, karmaşık modellerden önce şeffaf temel yöntemleri karşılaştırmak ve yalnız doğruluk yerine olasılık kalitesi ile kapasite kısıtlı sıralamayı ölçmek. UCI Online Retail II iki yıllık geçmişi nedeniyle seçilmiştir. Teknoloji yığını veri kaynağını, kiracı yalıtımını, model sürümlemeyi, rızayı ve insan onayını denetlenebilir tek akışta tutar.</w:t>
       </w:r>
     </w:p>
     <w:p>
@@ -220,7 +220,7 @@
         <w:pStyle w:val="Heading1"/>
       </w:pPr>
       <w:r>
-        <w:t>Part I — Literature review</w:t>
+        <w:t>Bölüm I — Literatür taraması</w:t>
       </w:r>
     </w:p>
     <w:p>
@@ -228,12 +228,12 @@
         <w:pStyle w:val="Heading2"/>
       </w:pPr>
       <w:r>
-        <w:t>1. Problem statement and research question</w:t>
+        <w:t>1. Problem ve araştırma sorusu</w:t>
       </w:r>
     </w:p>
     <w:p>
       <w:r>
-        <w:t>In a contractual service, a cancellation can identify churn directly. In non-contractual retail, silence is ambiguous: a customer may be between purchases, seasonally inactive or permanently lost. GrowthPilot therefore asks: How accurately and usefully can pre-cutoff transaction behavior identify customers who will make no eligible purchase during a fixed 90-day future window, while preserving calibration, explanation and governed marketing use?</w:t>
+        <w:t>Sözleşmeli hizmetlerde iptal müşteri kaybını gösterebilir. Sözleşmesiz perakendede sessizlik belirsizdir: müşteri iki satın alma arasında, mevsimsel olarak pasif veya kalıcı biçimde kaybedilmiş olabilir. Araştırma sorusu şudur: Kesim tarihinden önceki işlem davranışı, sabit 90 günlük gelecek penceresinde uygun satın alma yapmayacak müşterileri; kalibrasyon, açıklanabilirlik ve yönetişimli pazarlama kullanımını koruyarak ne kadar doğru ve yararlı belirleyebilir?</w:t>
       </w:r>
     </w:p>
     <w:p>
@@ -241,17 +241,17 @@
         <w:pStyle w:val="Heading2"/>
       </w:pPr>
       <w:r>
-        <w:t>2. Theme one: customer status is latent</w:t>
+        <w:t>2. Müşteri durumu örtüktür</w:t>
       </w:r>
     </w:p>
     <w:p>
       <w:r>
-        <w:t>Jerath, Fader and Hardie (2011) show that models of customer “death” can encode materially different assumptions about when dropout occurs. Pareto/NBD treats dropout as a calendar-time process; BG/NBD attaches the opportunity to transaction time. Their comparison matters operationally because customer-status estimates depend on model assumptions, not an observable fact. Batislam, Denizel and Filiztekin (2007) likewise compare Pareto/NBD and BG/NBD on grocery transactions and frame active status and future purchasing as distinct predictive goals.</w:t>
+        <w:t>Jerath, Fader ve Hardie (2011), müşteri “ölümü” modellerinin kayıp zamanına ilişkin farklı varsayımlar içerdiğini gösterir. Pareto/NBD kaybı takvim zamanında, BG/NBD ise işlem zamanında ele alır. Dolayısıyla müşteri durumu gözlenebilir bir olgudan çok model varsayımlarına bağlıdır. Batislam, Denizel ve Filiztekin (2007) de market işlemlerinde Pareto/NBD ve BG/NBD'yi karşılaştırıp aktif durum ile gelecekte satın almayı ayrı hedefler olarak inceler.</w:t>
       </w:r>
     </w:p>
     <w:p>
       <w:r>
-        <w:t>Platzer and Reutterer (2016) add purchase regularity to non-contractual customer-base models. This is important for GrowthPilot: a memoryless rule may mark a naturally periodic buyer as inactive. The implementation therefore includes recency, frequency, tenure and interpurchase-gap features, while still naming the target future inactivity rather than true churn.</w:t>
+        <w:t>Platzer ve Reutterer (2016), satın alma düzenliliğini sözleşmesiz müşteri tabanı modellerine ekler. Belleksiz bir kural dönemsel satın alan kişiyi yanlışlıkla pasif sayabilir. GrowthPilot bu nedenle yakınlık, sıklık, müşteri yaşı ve satın almalar arası süre özelliklerini kullanır; hedefi “gerçek kayıp” değil, “gelecekte hareketsizlik” olarak adlandırır.</w:t>
       </w:r>
     </w:p>
     <w:p>
@@ -259,17 +259,17 @@
         <w:pStyle w:val="Heading2"/>
       </w:pPr>
       <w:r>
-        <w:t>3. Theme two: evaluation must match a marketing decision</w:t>
+        <w:t>3. Değerlendirme pazarlama kararıyla uyumlu olmalıdır</w:t>
       </w:r>
     </w:p>
     <w:p>
       <w:r>
-        <w:t>A marketing team cannot contact every customer. Model evaluation therefore needs both statistical discrimination and an operating policy. PR-AUC is emphasized because inactivity prevalence changes across time; ROC-AUC remains a secondary ranking measure. Brier score, log loss and expected calibration error test probability quality. Precision, recall and lift in the highest-risk 5%, 10% and 20% translate scores into outreach-capacity evidence.</w:t>
+        <w:t>Her müşteriyle iletişim kurulamayacağından değerlendirme hem ayırt ediciliği hem operasyon politikasını kapsar. Yaygınlık zamanla değiştiği için PR-AUC birincil, ROC-AUC ikincil sıralama ölçütüdür. Brier, log kaybı ve ECE olasılık kalitesini; en riskli %5, %10 ve %20'de kesinlik, duyarlılık ve artış erişim kapasitesini ölçer.</w:t>
       </w:r>
     </w:p>
     <w:p>
       <w:r>
-        <w:t>The final operating threshold was chosen on a separate calibration period as the score boundary for approximately 10% capacity, then frozen. This avoids choosing a threshold on the final temporal test. Campaign outcomes would require a randomized or credible quasi-experimental design; predictive lift alone cannot establish incremental marketing impact.</w:t>
+        <w:t>Operasyon eşiği ayrı kalibrasyon döneminde yaklaşık %10 kapasiteye göre seçilip dondurulmuştur. Böylece nihai testte eşik seçimi yapılmamıştır. Kampanya etkisi için rastgeleleştirilmiş veya güvenilir yarı deneysel tasarım gerekir; tahmine dayalı artış nedensel etki değildir.</w:t>
       </w:r>
     </w:p>
     <w:p>
@@ -277,12 +277,12 @@
         <w:pStyle w:val="Heading2"/>
       </w:pPr>
       <w:r>
-        <w:t>4. Theme three: explanation and governance</w:t>
+        <w:t>4. Açıklanabilirlik ve yönetişim</w:t>
       </w:r>
     </w:p>
     <w:p>
       <w:r>
-        <w:t>Explainability is useful only when its scope is explicit. Logistic coefficients and SHAP decompositions explain how the fitted model formed a score; they do not show that changing a feature will change behavior. GrowthPilot stores model, feature, target and split versions, artifact checksums and explanation payloads. Any recommendation is still constrained by current consent, purpose, role permissions, approval state, kill switch and budget limit.</w:t>
+        <w:t>Lojistik katsayılar ve SHAP ayrıştırmaları modelin puanı nasıl oluşturduğunu açıklar; bir özelliği değiştirmenin davranışı değiştireceğini göstermez. GrowthPilot model, özellik, hedef ve veri bölümü sürümlerini, sağlama toplamlarını ve açıklamaları saklar. Öneriler güncel rıza, amaç, rol, onay, acil durdurma anahtarı ve bütçe sınırıyla kısıtlanır.</w:t>
       </w:r>
     </w:p>
     <w:p>
@@ -290,7 +290,7 @@
         <w:pStyle w:val="Heading2"/>
       </w:pPr>
       <w:r>
-        <w:t>5. Comparative synthesis</w:t>
+        <w:t>5. Karşılaştırmalı sentez</w:t>
       </w:r>
     </w:p>
     <w:tbl>
@@ -303,10 +303,10 @@
         <w:tblInd w:w="120" w:type="dxa"/>
       </w:tblPr>
       <w:tblGrid>
-        <w:gridCol w:w="1450"/>
-        <w:gridCol w:w="2850"/>
-        <w:gridCol w:w="2700"/>
-        <w:gridCol w:w="2360"/>
+        <w:gridCol w:w="2340"/>
+        <w:gridCol w:w="2340"/>
+        <w:gridCol w:w="2340"/>
+        <w:gridCol w:w="2340"/>
       </w:tblGrid>
       <w:tr>
         <w:trPr>
@@ -315,7 +315,7 @@
         </w:trPr>
         <w:tc>
           <w:tcPr>
-            <w:tcW w:type="dxa" w:w="1450"/>
+            <w:tcW w:type="dxa" w:w="2340"/>
             <w:tcMar>
               <w:top w:w="80" w:type="dxa"/>
               <w:start w:w="120" w:type="dxa"/>
@@ -336,13 +336,13 @@
                 <w:color w:val="173B32"/>
                 <w:sz w:val="19"/>
               </w:rPr>
-              <w:t>Source</w:t>
+              <w:t>Kaynak</w:t>
             </w:r>
           </w:p>
         </w:tc>
         <w:tc>
           <w:tcPr>
-            <w:tcW w:type="dxa" w:w="2850"/>
+            <w:tcW w:type="dxa" w:w="2340"/>
             <w:tcMar>
               <w:top w:w="80" w:type="dxa"/>
               <w:start w:w="120" w:type="dxa"/>
@@ -363,13 +363,13 @@
                 <w:color w:val="173B32"/>
                 <w:sz w:val="19"/>
               </w:rPr>
-              <w:t>Objective / data / method</w:t>
+              <w:t>Amaç / yöntem</w:t>
             </w:r>
           </w:p>
         </w:tc>
         <w:tc>
           <w:tcPr>
-            <w:tcW w:type="dxa" w:w="2700"/>
+            <w:tcW w:type="dxa" w:w="2340"/>
             <w:tcMar>
               <w:top w:w="80" w:type="dxa"/>
               <w:start w:w="120" w:type="dxa"/>
@@ -390,13 +390,13 @@
                 <w:color w:val="173B32"/>
                 <w:sz w:val="19"/>
               </w:rPr>
-              <w:t>Findings used</w:t>
+              <w:t>Kullanılan bulgu</w:t>
             </w:r>
           </w:p>
         </w:tc>
         <w:tc>
           <w:tcPr>
-            <w:tcW w:type="dxa" w:w="2360"/>
+            <w:tcW w:type="dxa" w:w="2340"/>
             <w:tcMar>
               <w:top w:w="80" w:type="dxa"/>
               <w:start w:w="120" w:type="dxa"/>
@@ -417,7 +417,7 @@
                 <w:color w:val="173B32"/>
                 <w:sz w:val="19"/>
               </w:rPr>
-              <w:t>Strength / limitation</w:t>
+              <w:t>Sınırlılık</w:t>
             </w:r>
           </w:p>
         </w:tc>
@@ -428,7 +428,7 @@
         </w:trPr>
         <w:tc>
           <w:tcPr>
-            <w:tcW w:type="dxa" w:w="1450"/>
+            <w:tcW w:type="dxa" w:w="2340"/>
             <w:vAlign w:val="top"/>
           </w:tcPr>
           <w:p>
@@ -441,13 +441,13 @@
                 <w:color w:val="000000"/>
                 <w:sz w:val="18"/>
               </w:rPr>
-              <w:t>Jerath, Fader &amp; Hardie (2011)</w:t>
+              <w:t>Jerath, Fader ve Hardie (2011)</w:t>
             </w:r>
           </w:p>
         </w:tc>
         <w:tc>
           <w:tcPr>
-            <w:tcW w:type="dxa" w:w="2850"/>
+            <w:tcW w:type="dxa" w:w="2340"/>
             <w:vAlign w:val="top"/>
           </w:tcPr>
           <w:p>
@@ -460,13 +460,13 @@
                 <w:color w:val="000000"/>
                 <w:sz w:val="18"/>
               </w:rPr>
-              <w:t>Non-contractual customer death; two empirical datasets; PDO vs Pareto/NBD/BG-NBD</w:t>
+              <w:t>Sözleşmesiz müşteri kaybı; PDO, Pareto/NBD, BG/NBD</w:t>
             </w:r>
           </w:p>
         </w:tc>
         <w:tc>
           <w:tcPr>
-            <w:tcW w:type="dxa" w:w="2700"/>
+            <w:tcW w:type="dxa" w:w="2340"/>
             <w:vAlign w:val="top"/>
           </w:tcPr>
           <w:p>
@@ -479,13 +479,13 @@
                 <w:color w:val="000000"/>
                 <w:sz w:val="18"/>
               </w:rPr>
-              <w:t>Dropout-time assumptions change customer metrics</w:t>
+              <w:t>Kayıp zamanı varsayımları ölçütleri değiştirir</w:t>
             </w:r>
           </w:p>
         </w:tc>
         <w:tc>
           <w:tcPr>
-            <w:tcW w:type="dxa" w:w="2360"/>
+            <w:tcW w:type="dxa" w:w="2340"/>
             <w:vAlign w:val="top"/>
           </w:tcPr>
           <w:p>
@@ -498,7 +498,7 @@
                 <w:color w:val="000000"/>
                 <w:sz w:val="18"/>
               </w:rPr>
-              <w:t>Strong conceptual warning; not a supervised campaign-effect study</w:t>
+              <w:t>Denetimli kampanya etkisi çalışması değildir</w:t>
             </w:r>
           </w:p>
         </w:tc>
@@ -509,7 +509,7 @@
         </w:trPr>
         <w:tc>
           <w:tcPr>
-            <w:tcW w:type="dxa" w:w="1450"/>
+            <w:tcW w:type="dxa" w:w="2340"/>
             <w:vAlign w:val="top"/>
           </w:tcPr>
           <w:p>
@@ -522,13 +522,13 @@
                 <w:color w:val="000000"/>
                 <w:sz w:val="18"/>
               </w:rPr>
-              <w:t>Batislam et al. (2007)</w:t>
+              <w:t>Batislam ve diğerleri (2007)</w:t>
             </w:r>
           </w:p>
         </w:tc>
         <w:tc>
           <w:tcPr>
-            <w:tcW w:type="dxa" w:w="2850"/>
+            <w:tcW w:type="dxa" w:w="2340"/>
             <w:vAlign w:val="top"/>
           </w:tcPr>
           <w:p>
@@ -541,13 +541,13 @@
                 <w:color w:val="000000"/>
                 <w:sz w:val="18"/>
               </w:rPr>
-              <w:t>Grocery customer base; empirical Pareto/NBD and BG/NBD comparison</w:t>
+              <w:t>Market verisinde Pareto/NBD ve BG/NBD</w:t>
             </w:r>
           </w:p>
         </w:tc>
         <w:tc>
           <w:tcPr>
-            <w:tcW w:type="dxa" w:w="2700"/>
+            <w:tcW w:type="dxa" w:w="2340"/>
             <w:vAlign w:val="top"/>
           </w:tcPr>
           <w:p>
@@ -560,13 +560,13 @@
                 <w:color w:val="000000"/>
                 <w:sz w:val="18"/>
               </w:rPr>
-              <w:t>Active status and future purchasing require validation</w:t>
+              <w:t>Aktif durum ve gelecekte satın alma doğrulanmalıdır</w:t>
             </w:r>
           </w:p>
         </w:tc>
         <w:tc>
           <w:tcPr>
-            <w:tcW w:type="dxa" w:w="2360"/>
+            <w:tcW w:type="dxa" w:w="2340"/>
             <w:vAlign w:val="top"/>
           </w:tcPr>
           <w:p>
@@ -579,7 +579,7 @@
                 <w:color w:val="000000"/>
                 <w:sz w:val="18"/>
               </w:rPr>
-              <w:t>Retail evidence; context does not guarantee transfer</w:t>
+              <w:t>Bağlam aktarılabilirliği garanti etmez</w:t>
             </w:r>
           </w:p>
         </w:tc>
@@ -590,7 +590,7 @@
         </w:trPr>
         <w:tc>
           <w:tcPr>
-            <w:tcW w:type="dxa" w:w="1450"/>
+            <w:tcW w:type="dxa" w:w="2340"/>
             <w:vAlign w:val="top"/>
           </w:tcPr>
           <w:p>
@@ -603,13 +603,13 @@
                 <w:color w:val="000000"/>
                 <w:sz w:val="18"/>
               </w:rPr>
-              <w:t>Platzer &amp; Reutterer (2016)</w:t>
+              <w:t>Platzer ve Reutterer (2016)</w:t>
             </w:r>
           </w:p>
         </w:tc>
         <w:tc>
           <w:tcPr>
-            <w:tcW w:type="dxa" w:w="2850"/>
+            <w:tcW w:type="dxa" w:w="2340"/>
             <w:vAlign w:val="top"/>
           </w:tcPr>
           <w:p>
@@ -622,13 +622,13 @@
                 <w:color w:val="000000"/>
                 <w:sz w:val="18"/>
               </w:rPr>
-              <w:t>Non-contractual transactions; purchase regularity extension</w:t>
+              <w:t>Satın alma düzenliliği uzantısı</w:t>
             </w:r>
           </w:p>
         </w:tc>
         <w:tc>
           <w:tcPr>
-            <w:tcW w:type="dxa" w:w="2700"/>
+            <w:tcW w:type="dxa" w:w="2340"/>
             <w:vAlign w:val="top"/>
           </w:tcPr>
           <w:p>
@@ -641,13 +641,13 @@
                 <w:color w:val="000000"/>
                 <w:sz w:val="18"/>
               </w:rPr>
-              <w:t>Periodic behavior can improve customer-base modeling</w:t>
+              <w:t>Dönemsellik modellemeyi geliştirebilir</w:t>
             </w:r>
           </w:p>
         </w:tc>
         <w:tc>
           <w:tcPr>
-            <w:tcW w:type="dxa" w:w="2360"/>
+            <w:tcW w:type="dxa" w:w="2340"/>
             <w:vAlign w:val="top"/>
           </w:tcPr>
           <w:p>
@@ -660,7 +660,7 @@
                 <w:color w:val="000000"/>
                 <w:sz w:val="18"/>
               </w:rPr>
-              <w:t>Addresses cadence; still model-dependent latent status</w:t>
+              <w:t>Örtük durum modele bağlıdır</w:t>
             </w:r>
           </w:p>
         </w:tc>
@@ -671,7 +671,7 @@
         </w:trPr>
         <w:tc>
           <w:tcPr>
-            <w:tcW w:type="dxa" w:w="1450"/>
+            <w:tcW w:type="dxa" w:w="2340"/>
             <w:vAlign w:val="top"/>
           </w:tcPr>
           <w:p>
@@ -684,13 +684,13 @@
                 <w:color w:val="000000"/>
                 <w:sz w:val="18"/>
               </w:rPr>
-              <w:t>Saito &amp; Rehmsmeier (2015)</w:t>
+              <w:t>Saito ve Rehmsmeier (2015)</w:t>
             </w:r>
           </w:p>
         </w:tc>
         <w:tc>
           <w:tcPr>
-            <w:tcW w:type="dxa" w:w="2850"/>
+            <w:tcW w:type="dxa" w:w="2340"/>
             <w:vAlign w:val="top"/>
           </w:tcPr>
           <w:p>
@@ -703,13 +703,13 @@
                 <w:color w:val="000000"/>
                 <w:sz w:val="18"/>
               </w:rPr>
-              <w:t>Imbalanced classification; ROC vs PR visualization</w:t>
+              <w:t>Dengesiz sınıflandırmada ROC ve PR</w:t>
             </w:r>
           </w:p>
         </w:tc>
         <w:tc>
           <w:tcPr>
-            <w:tcW w:type="dxa" w:w="2700"/>
+            <w:tcW w:type="dxa" w:w="2340"/>
             <w:vAlign w:val="top"/>
           </w:tcPr>
           <w:p>
@@ -722,13 +722,13 @@
                 <w:color w:val="000000"/>
                 <w:sz w:val="18"/>
               </w:rPr>
-              <w:t>PR analysis is informative when positives are uneven</w:t>
+              <w:t>Dengesiz pozitif sınıfta PR bilgilendiricidir</w:t>
             </w:r>
           </w:p>
         </w:tc>
         <w:tc>
           <w:tcPr>
-            <w:tcW w:type="dxa" w:w="2360"/>
+            <w:tcW w:type="dxa" w:w="2340"/>
             <w:vAlign w:val="top"/>
           </w:tcPr>
           <w:p>
@@ -741,7 +741,7 @@
                 <w:color w:val="000000"/>
                 <w:sz w:val="18"/>
               </w:rPr>
-              <w:t>Metric guidance; not retail-specific</w:t>
+              <w:t>Perakendeye özgü değildir</w:t>
             </w:r>
           </w:p>
         </w:tc>
@@ -752,7 +752,7 @@
         </w:trPr>
         <w:tc>
           <w:tcPr>
-            <w:tcW w:type="dxa" w:w="1450"/>
+            <w:tcW w:type="dxa" w:w="2340"/>
             <w:vAlign w:val="top"/>
           </w:tcPr>
           <w:p>
@@ -765,13 +765,13 @@
                 <w:color w:val="000000"/>
                 <w:sz w:val="18"/>
               </w:rPr>
-              <w:t>Lundberg &amp; Lee (2017)</w:t>
+              <w:t>Lundberg ve Lee (2017)</w:t>
             </w:r>
           </w:p>
         </w:tc>
         <w:tc>
           <w:tcPr>
-            <w:tcW w:type="dxa" w:w="2850"/>
+            <w:tcW w:type="dxa" w:w="2340"/>
             <w:vAlign w:val="top"/>
           </w:tcPr>
           <w:p>
@@ -784,13 +784,13 @@
                 <w:color w:val="000000"/>
                 <w:sz w:val="18"/>
               </w:rPr>
-              <w:t>Unified additive feature-attribution framework</w:t>
+              <w:t>Toplamsal özellik katkısı</w:t>
             </w:r>
           </w:p>
         </w:tc>
         <w:tc>
           <w:tcPr>
-            <w:tcW w:type="dxa" w:w="2700"/>
+            <w:tcW w:type="dxa" w:w="2340"/>
             <w:vAlign w:val="top"/>
           </w:tcPr>
           <w:p>
@@ -803,13 +803,13 @@
                 <w:color w:val="000000"/>
                 <w:sz w:val="18"/>
               </w:rPr>
-              <w:t>Local/global fitted-model explanations can be validated additively</w:t>
+              <w:t>Model açıklamaları toplamsal doğrulanabilir</w:t>
             </w:r>
           </w:p>
         </w:tc>
         <w:tc>
           <w:tcPr>
-            <w:tcW w:type="dxa" w:w="2360"/>
+            <w:tcW w:type="dxa" w:w="2340"/>
             <w:vAlign w:val="top"/>
           </w:tcPr>
           <w:p>
@@ -822,7 +822,7 @@
                 <w:color w:val="000000"/>
                 <w:sz w:val="18"/>
               </w:rPr>
-              <w:t>Explanation is not causal attribution</w:t>
+              <w:t>Açıklama nedensellik değildir</w:t>
             </w:r>
           </w:p>
         </w:tc>
@@ -834,17 +834,8 @@
       </w:pPr>
     </w:p>
     <w:p>
-      <w:pPr>
-        <w:spacing w:before="80" w:after="80"/>
-      </w:pPr>
       <w:r>
-        <w:rPr>
-          <w:rFonts w:ascii="Calibri" w:hAnsi="Calibri"/>
-          <w:i/>
-          <w:color w:val="547068"/>
-          <w:sz w:val="17"/>
-        </w:rPr>
-        <w:t>Evidence class: external-source synthesis. No GrowthPilot performance result is claimed in this table.</w:t>
+        <w:t>Kanıt sınıfı: dış kaynak sentezi. GrowthPilot performans sonucu ileri sürülmemektedir.</w:t>
       </w:r>
     </w:p>
     <w:p>
@@ -852,12 +843,12 @@
         <w:pStyle w:val="Heading2"/>
       </w:pPr>
       <w:r>
-        <w:t>6. Marketing gap and contribution</w:t>
+        <w:t>6. Pazarlama boşluğu ve katkı</w:t>
       </w:r>
     </w:p>
     <w:p>
       <w:r>
-        <w:t>The gap is not another isolated churn notebook. Small teams need a traceable path from raw records to a human decision: canonical data, versioned features, honest probability estimates, consent-aware prioritization and an approval gate. GrowthPilot contributes an integrated implementation and a reproducible capstone evaluation. It does not claim that one historical UK retailer represents every market, that future inactivity equals permanent churn, or that targeted outreach produces incremental revenue.</w:t>
+        <w:t>İhtiyaç başka bir bağımsız müşteri kaybı not defteri değil; ham kayıttan insan kararına uzanan izlenebilir bir yoldur: standart veri, sürümlü özellikler, dürüst olasılıklar, rızaya duyarlı önceliklendirme ve onay kapısı. GrowthPilot bütünleşik uygulama ile yeniden üretilebilir değerlendirme sunar; tek tarihsel Birleşik Krallık perakendecisinin tüm pazarları temsil ettiğini, hareketsizliğin kalıcı kayıp olduğunu veya hedefli iletişimin gelir yarattığını iddia etmez.</w:t>
       </w:r>
     </w:p>
     <w:p>
@@ -865,12 +856,12 @@
         <w:pStyle w:val="Heading2"/>
       </w:pPr>
       <w:r>
-        <w:t>7. Literature conclusion</w:t>
+        <w:t>7. Literatür sonucu</w:t>
       </w:r>
     </w:p>
     <w:p>
       <w:r>
-        <w:t>The literature justifies a conservative label and evaluation design. It also motivates explicit cadence features and the separation of prediction, explanation and causal effectiveness. These principles are encoded in the target memo, temporal split, model card and guarded marketing workflow.</w:t>
+        <w:t>Literatür ihtiyatlı etiket/değerlendirme tasarımını, satın alma ritmi özelliklerini ve tahmin, açıklama ile nedensel etkinliğin ayrılmasını destekler. Bunlar hedef notu, zamansal bölme, model kartı ve korumalı pazarlama akışına işlenmiştir.</w:t>
       </w:r>
     </w:p>
     <w:p>
@@ -878,7 +869,7 @@
         <w:pStyle w:val="Heading1"/>
       </w:pPr>
       <w:r>
-        <w:t>Part II — Data research</w:t>
+        <w:t>Bölüm II — Veri araştırması</w:t>
       </w:r>
     </w:p>
     <w:p>
@@ -886,12 +877,12 @@
         <w:pStyle w:val="Heading2"/>
       </w:pPr>
       <w:r>
-        <w:t>1. Objective and data needs</w:t>
+        <w:t>1. Amaç ve gereksinimler</w:t>
       </w:r>
     </w:p>
     <w:p>
       <w:r>
-        <w:t>The data must support customer-level history before a cutoff and fully observed future outcomes after it. Required fields are a stable customer identifier, transaction/invoice identifier, timestamp, product identifier, quantity and price. Cancellation indicators, country and descriptions help quality checks. Advertising data is not required to train the first churn-proxy model; it belongs to later attribution and activation workflows.</w:t>
+        <w:t>Veri, kesim öncesi müşteri geçmişini ve sonrasında tam gözlenen sonucu desteklemelidir. Gerekli alanlar müşteri, işlem/fatura ve ürün kimliği; zaman, miktar ve fiyattır. İptal, ülke ve açıklama kalite kontrolüne yardım eder. Reklam verisi ilk modeli eğitmek için değil, sonraki atıf ve etkinleştirme akışları için gerekir.</w:t>
       </w:r>
     </w:p>
     <w:p>
@@ -899,7 +890,7 @@
         <w:pStyle w:val="Heading2"/>
       </w:pPr>
       <w:r>
-        <w:t>2. Candidate assessment</w:t>
+        <w:t>2. Aday değerlendirmesi</w:t>
       </w:r>
     </w:p>
     <w:tbl>
@@ -912,10 +903,10 @@
         <w:tblInd w:w="120" w:type="dxa"/>
       </w:tblPr>
       <w:tblGrid>
-        <w:gridCol w:w="1900"/>
-        <w:gridCol w:w="3300"/>
-        <w:gridCol w:w="2780"/>
-        <w:gridCol w:w="1380"/>
+        <w:gridCol w:w="2340"/>
+        <w:gridCol w:w="2340"/>
+        <w:gridCol w:w="2340"/>
+        <w:gridCol w:w="2340"/>
       </w:tblGrid>
       <w:tr>
         <w:trPr>
@@ -924,7 +915,7 @@
         </w:trPr>
         <w:tc>
           <w:tcPr>
-            <w:tcW w:type="dxa" w:w="1900"/>
+            <w:tcW w:type="dxa" w:w="2340"/>
             <w:tcMar>
               <w:top w:w="80" w:type="dxa"/>
               <w:start w:w="120" w:type="dxa"/>
@@ -945,13 +936,13 @@
                 <w:color w:val="173B32"/>
                 <w:sz w:val="19"/>
               </w:rPr>
-              <w:t>Dataset</w:t>
+              <w:t>Veri kümesi</w:t>
             </w:r>
           </w:p>
         </w:tc>
         <w:tc>
           <w:tcPr>
-            <w:tcW w:type="dxa" w:w="3300"/>
+            <w:tcW w:type="dxa" w:w="2340"/>
             <w:tcMar>
               <w:top w:w="80" w:type="dxa"/>
               <w:start w:w="120" w:type="dxa"/>
@@ -972,13 +963,13 @@
                 <w:color w:val="173B32"/>
                 <w:sz w:val="19"/>
               </w:rPr>
-              <w:t>Scope / access</w:t>
+              <w:t>Kapsam / erişim</w:t>
             </w:r>
           </w:p>
         </w:tc>
         <w:tc>
           <w:tcPr>
-            <w:tcW w:type="dxa" w:w="2780"/>
+            <w:tcW w:type="dxa" w:w="2340"/>
             <w:tcMar>
               <w:top w:w="80" w:type="dxa"/>
               <w:start w:w="120" w:type="dxa"/>
@@ -999,13 +990,13 @@
                 <w:color w:val="173B32"/>
                 <w:sz w:val="19"/>
               </w:rPr>
-              <w:t>Fit</w:t>
+              <w:t>Uygunluk</w:t>
             </w:r>
           </w:p>
         </w:tc>
         <w:tc>
           <w:tcPr>
-            <w:tcW w:type="dxa" w:w="1380"/>
+            <w:tcW w:type="dxa" w:w="2340"/>
             <w:tcMar>
               <w:top w:w="80" w:type="dxa"/>
               <w:start w:w="120" w:type="dxa"/>
@@ -1026,7 +1017,7 @@
                 <w:color w:val="173B32"/>
                 <w:sz w:val="19"/>
               </w:rPr>
-              <w:t>Decision</w:t>
+              <w:t>Karar</w:t>
             </w:r>
           </w:p>
         </w:tc>
@@ -1037,7 +1028,7 @@
         </w:trPr>
         <w:tc>
           <w:tcPr>
-            <w:tcW w:type="dxa" w:w="1900"/>
+            <w:tcW w:type="dxa" w:w="2340"/>
             <w:vAlign w:val="top"/>
           </w:tcPr>
           <w:p>
@@ -1056,7 +1047,7 @@
         </w:tc>
         <w:tc>
           <w:tcPr>
-            <w:tcW w:type="dxa" w:w="3300"/>
+            <w:tcW w:type="dxa" w:w="2340"/>
             <w:vAlign w:val="top"/>
           </w:tcPr>
           <w:p>
@@ -1069,13 +1060,13 @@
                 <w:color w:val="000000"/>
                 <w:sz w:val="18"/>
               </w:rPr>
-              <w:t>1,067,371 lines; 2009-12-01 to 2011-12-09; XLSX; CC BY 4.0; DOI 10.24432/C5CG6D</w:t>
+              <w:t>1.067.371 satır; 2009-12-01–2011-12-09; XLSX; CC BY 4.0; DOI 10.24432/C5CG6D</w:t>
             </w:r>
           </w:p>
         </w:tc>
         <w:tc>
           <w:tcPr>
-            <w:tcW w:type="dxa" w:w="2780"/>
+            <w:tcW w:type="dxa" w:w="2340"/>
             <w:vAlign w:val="top"/>
           </w:tcPr>
           <w:p>
@@ -1088,13 +1079,13 @@
                 <w:color w:val="000000"/>
                 <w:sz w:val="18"/>
               </w:rPr>
-              <w:t>Two years, stable customer/invoice/time fields, multiple temporal cutoffs</w:t>
+              <w:t>İki yıl ve birden çok zamansal kesim</w:t>
             </w:r>
           </w:p>
         </w:tc>
         <w:tc>
           <w:tcPr>
-            <w:tcW w:type="dxa" w:w="1380"/>
+            <w:tcW w:type="dxa" w:w="2340"/>
             <w:vAlign w:val="top"/>
           </w:tcPr>
           <w:p>
@@ -1107,7 +1098,7 @@
                 <w:color w:val="000000"/>
                 <w:sz w:val="18"/>
               </w:rPr>
-              <w:t>Selected</w:t>
+              <w:t>Seçildi</w:t>
             </w:r>
           </w:p>
         </w:tc>
@@ -1118,7 +1109,7 @@
         </w:trPr>
         <w:tc>
           <w:tcPr>
-            <w:tcW w:type="dxa" w:w="1900"/>
+            <w:tcW w:type="dxa" w:w="2340"/>
             <w:vAlign w:val="top"/>
           </w:tcPr>
           <w:p>
@@ -1137,7 +1128,7 @@
         </w:tc>
         <w:tc>
           <w:tcPr>
-            <w:tcW w:type="dxa" w:w="3300"/>
+            <w:tcW w:type="dxa" w:w="2340"/>
             <w:vAlign w:val="top"/>
           </w:tcPr>
           <w:p>
@@ -1150,13 +1141,13 @@
                 <w:color w:val="000000"/>
                 <w:sz w:val="18"/>
               </w:rPr>
-              <w:t>541,909 lines; approximately one year; CC BY 4.0; DOI 10.24432/C5BW33</w:t>
+              <w:t>541.909 satır; yaklaşık bir yıl; CC BY 4.0; DOI 10.24432/C5BW33</w:t>
             </w:r>
           </w:p>
         </w:tc>
         <w:tc>
           <w:tcPr>
-            <w:tcW w:type="dxa" w:w="2780"/>
+            <w:tcW w:type="dxa" w:w="2340"/>
             <w:vAlign w:val="top"/>
           </w:tcPr>
           <w:p>
@@ -1169,13 +1160,13 @@
                 <w:color w:val="000000"/>
                 <w:sz w:val="18"/>
               </w:rPr>
-              <w:t>Same retailer but shorter history</w:t>
+              <w:t>Aynı perakendeci, daha kısa geçmiş</w:t>
             </w:r>
           </w:p>
         </w:tc>
         <w:tc>
           <w:tcPr>
-            <w:tcW w:type="dxa" w:w="1380"/>
+            <w:tcW w:type="dxa" w:w="2340"/>
             <w:vAlign w:val="top"/>
           </w:tcPr>
           <w:p>
@@ -1188,7 +1179,7 @@
                 <w:color w:val="000000"/>
                 <w:sz w:val="18"/>
               </w:rPr>
-              <w:t>Rejected in favor of longer source</w:t>
+              <w:t>Elendi</w:t>
             </w:r>
           </w:p>
         </w:tc>
@@ -1199,7 +1190,7 @@
         </w:trPr>
         <w:tc>
           <w:tcPr>
-            <w:tcW w:type="dxa" w:w="1900"/>
+            <w:tcW w:type="dxa" w:w="2340"/>
             <w:vAlign w:val="top"/>
           </w:tcPr>
           <w:p>
@@ -1218,7 +1209,7 @@
         </w:tc>
         <w:tc>
           <w:tcPr>
-            <w:tcW w:type="dxa" w:w="3300"/>
+            <w:tcW w:type="dxa" w:w="2340"/>
             <w:vAlign w:val="top"/>
           </w:tcPr>
           <w:p>
@@ -1231,13 +1222,13 @@
                 <w:color w:val="000000"/>
                 <w:sz w:val="18"/>
               </w:rPr>
-              <w:t>12,330 sessions; CC BY 4.0; DOI 10.24432/C5F88Q</w:t>
+              <w:t>12.330 oturum; CC BY 4.0; DOI 10.24432/C5F88Q</w:t>
             </w:r>
           </w:p>
         </w:tc>
         <w:tc>
           <w:tcPr>
-            <w:tcW w:type="dxa" w:w="2780"/>
+            <w:tcW w:type="dxa" w:w="2340"/>
             <w:vAlign w:val="top"/>
           </w:tcPr>
           <w:p>
@@ -1250,13 +1241,13 @@
                 <w:color w:val="000000"/>
                 <w:sz w:val="18"/>
               </w:rPr>
-              <w:t>Session conversion, not longitudinal customer inactivity</w:t>
+              <w:t>Oturum dönüşümü; müşteri hareketsizliği değil</w:t>
             </w:r>
           </w:p>
         </w:tc>
         <w:tc>
           <w:tcPr>
-            <w:tcW w:type="dxa" w:w="1380"/>
+            <w:tcW w:type="dxa" w:w="2340"/>
             <w:vAlign w:val="top"/>
           </w:tcPr>
           <w:p>
@@ -1269,7 +1260,7 @@
                 <w:color w:val="000000"/>
                 <w:sz w:val="18"/>
               </w:rPr>
-              <w:t>Rejected</w:t>
+              <w:t>Elendi</w:t>
             </w:r>
           </w:p>
         </w:tc>
@@ -1281,17 +1272,8 @@
       </w:pPr>
     </w:p>
     <w:p>
-      <w:pPr>
-        <w:spacing w:before="80" w:after="80"/>
-      </w:pPr>
       <w:r>
-        <w:rPr>
-          <w:rFonts w:ascii="Calibri" w:hAnsi="Calibri"/>
-          <w:i/>
-          <w:color w:val="547068"/>
-          <w:sz w:val="17"/>
-        </w:rPr>
-        <w:t>Sources: UCI dataset records and repository dataset decision memo.</w:t>
+        <w:t>Kaynaklar: UCI kayıtları ve depo veri kümesi karar notu.</w:t>
       </w:r>
     </w:p>
     <w:p>
@@ -1299,7 +1281,7 @@
         <w:pStyle w:val="Heading2"/>
       </w:pPr>
       <w:r>
-        <w:t>3. Selected source profile</w:t>
+        <w:t>3. Seçilen kaynak profili</w:t>
       </w:r>
     </w:p>
     <w:tbl>
@@ -1312,8 +1294,8 @@
         <w:tblInd w:w="120" w:type="dxa"/>
       </w:tblPr>
       <w:tblGrid>
-        <w:gridCol w:w="2500"/>
-        <w:gridCol w:w="6860"/>
+        <w:gridCol w:w="4680"/>
+        <w:gridCol w:w="4680"/>
       </w:tblGrid>
       <w:tr>
         <w:trPr>
@@ -1322,7 +1304,7 @@
         </w:trPr>
         <w:tc>
           <w:tcPr>
-            <w:tcW w:type="dxa" w:w="2500"/>
+            <w:tcW w:type="dxa" w:w="4680"/>
             <w:tcMar>
               <w:top w:w="80" w:type="dxa"/>
               <w:start w:w="120" w:type="dxa"/>
@@ -1343,13 +1325,13 @@
                 <w:color w:val="173B32"/>
                 <w:sz w:val="19"/>
               </w:rPr>
-              <w:t>Dimension</w:t>
+              <w:t>Boyut</w:t>
             </w:r>
           </w:p>
         </w:tc>
         <w:tc>
           <w:tcPr>
-            <w:tcW w:type="dxa" w:w="6860"/>
+            <w:tcW w:type="dxa" w:w="4680"/>
             <w:tcMar>
               <w:top w:w="80" w:type="dxa"/>
               <w:start w:w="120" w:type="dxa"/>
@@ -1370,7 +1352,7 @@
                 <w:color w:val="173B32"/>
                 <w:sz w:val="19"/>
               </w:rPr>
-              <w:t>Project-reproduced value</w:t>
+              <w:t>Projede yeniden üretilen değer</w:t>
             </w:r>
           </w:p>
         </w:tc>
@@ -1381,7 +1363,7 @@
         </w:trPr>
         <w:tc>
           <w:tcPr>
-            <w:tcW w:type="dxa" w:w="2500"/>
+            <w:tcW w:type="dxa" w:w="4680"/>
             <w:vAlign w:val="top"/>
           </w:tcPr>
           <w:p>
@@ -1394,13 +1376,13 @@
                 <w:color w:val="000000"/>
                 <w:sz w:val="18"/>
               </w:rPr>
-              <w:t>Raw size</w:t>
+              <w:t>Ham boyut</w:t>
             </w:r>
           </w:p>
         </w:tc>
         <w:tc>
           <w:tcPr>
-            <w:tcW w:type="dxa" w:w="6860"/>
+            <w:tcW w:type="dxa" w:w="4680"/>
             <w:vAlign w:val="top"/>
           </w:tcPr>
           <w:p>
@@ -1413,7 +1395,7 @@
                 <w:color w:val="000000"/>
                 <w:sz w:val="18"/>
               </w:rPr>
-              <w:t>1,067,371 rows; 8 fields; 43 countries</w:t>
+              <w:t>1.067.371 satır; 8 alan; 43 ülke</w:t>
             </w:r>
           </w:p>
         </w:tc>
@@ -1424,7 +1406,7 @@
         </w:trPr>
         <w:tc>
           <w:tcPr>
-            <w:tcW w:type="dxa" w:w="2500"/>
+            <w:tcW w:type="dxa" w:w="4680"/>
             <w:vAlign w:val="top"/>
           </w:tcPr>
           <w:p>
@@ -1437,13 +1419,13 @@
                 <w:color w:val="000000"/>
                 <w:sz w:val="18"/>
               </w:rPr>
-              <w:t>Period</w:t>
+              <w:t>Dönem</w:t>
             </w:r>
           </w:p>
         </w:tc>
         <w:tc>
           <w:tcPr>
-            <w:tcW w:type="dxa" w:w="6860"/>
+            <w:tcW w:type="dxa" w:w="4680"/>
             <w:vAlign w:val="top"/>
           </w:tcPr>
           <w:p>
@@ -1456,7 +1438,7 @@
                 <w:color w:val="000000"/>
                 <w:sz w:val="18"/>
               </w:rPr>
-              <w:t>2009-12-01 to 2011-12-09</w:t>
+              <w:t>2009-12-01–2011-12-09</w:t>
             </w:r>
           </w:p>
         </w:tc>
@@ -1467,7 +1449,7 @@
         </w:trPr>
         <w:tc>
           <w:tcPr>
-            <w:tcW w:type="dxa" w:w="2500"/>
+            <w:tcW w:type="dxa" w:w="4680"/>
             <w:vAlign w:val="top"/>
           </w:tcPr>
           <w:p>
@@ -1480,13 +1462,13 @@
                 <w:color w:val="000000"/>
                 <w:sz w:val="18"/>
               </w:rPr>
-              <w:t>Customers / invoices</w:t>
+              <w:t>Müşteriler / faturalar</w:t>
             </w:r>
           </w:p>
         </w:tc>
         <w:tc>
           <w:tcPr>
-            <w:tcW w:type="dxa" w:w="6860"/>
+            <w:tcW w:type="dxa" w:w="4680"/>
             <w:vAlign w:val="top"/>
           </w:tcPr>
           <w:p>
@@ -1499,7 +1481,7 @@
                 <w:color w:val="000000"/>
                 <w:sz w:val="18"/>
               </w:rPr>
-              <w:t>5,942 identified customers; 53,628 invoices</w:t>
+              <w:t>5.942 tanımlı müşteri; 53.628 fatura</w:t>
             </w:r>
           </w:p>
         </w:tc>
@@ -1510,7 +1492,7 @@
         </w:trPr>
         <w:tc>
           <w:tcPr>
-            <w:tcW w:type="dxa" w:w="2500"/>
+            <w:tcW w:type="dxa" w:w="4680"/>
             <w:vAlign w:val="top"/>
           </w:tcPr>
           <w:p>
@@ -1523,13 +1505,13 @@
                 <w:color w:val="000000"/>
                 <w:sz w:val="18"/>
               </w:rPr>
-              <w:t>Missingness</w:t>
+              <w:t>Eksiklik</w:t>
             </w:r>
           </w:p>
         </w:tc>
         <w:tc>
           <w:tcPr>
-            <w:tcW w:type="dxa" w:w="6860"/>
+            <w:tcW w:type="dxa" w:w="4680"/>
             <w:vAlign w:val="top"/>
           </w:tcPr>
           <w:p>
@@ -1542,7 +1524,7 @@
                 <w:color w:val="000000"/>
                 <w:sz w:val="18"/>
               </w:rPr>
-              <w:t>243,007 rows missing customer ID; 4,382 missing description</w:t>
+              <w:t>Müşteri kimliği eksik 243.007; açıklama eksik 4.382 satır</w:t>
             </w:r>
           </w:p>
         </w:tc>
@@ -1553,7 +1535,7 @@
         </w:trPr>
         <w:tc>
           <w:tcPr>
-            <w:tcW w:type="dxa" w:w="2500"/>
+            <w:tcW w:type="dxa" w:w="4680"/>
             <w:vAlign w:val="top"/>
           </w:tcPr>
           <w:p>
@@ -1566,13 +1548,13 @@
                 <w:color w:val="000000"/>
                 <w:sz w:val="18"/>
               </w:rPr>
-              <w:t>Transaction anomalies</w:t>
+              <w:t>Aykırılıklar</w:t>
             </w:r>
           </w:p>
         </w:tc>
         <w:tc>
           <w:tcPr>
-            <w:tcW w:type="dxa" w:w="6860"/>
+            <w:tcW w:type="dxa" w:w="4680"/>
             <w:vAlign w:val="top"/>
           </w:tcPr>
           <w:p>
@@ -1585,7 +1567,7 @@
                 <w:color w:val="000000"/>
                 <w:sz w:val="18"/>
               </w:rPr>
-              <w:t>19,494 cancellation rows; 22,950 nonpositive quantity; 6,207 nonpositive price</w:t>
+              <w:t>19.494 iptal; 22.950 pozitif olmayan miktar; 6.207 pozitif olmayan fiyat</w:t>
             </w:r>
           </w:p>
         </w:tc>
@@ -1596,7 +1578,7 @@
         </w:trPr>
         <w:tc>
           <w:tcPr>
-            <w:tcW w:type="dxa" w:w="2500"/>
+            <w:tcW w:type="dxa" w:w="4680"/>
             <w:vAlign w:val="top"/>
           </w:tcPr>
           <w:p>
@@ -1609,13 +1591,13 @@
                 <w:color w:val="000000"/>
                 <w:sz w:val="18"/>
               </w:rPr>
-              <w:t>Duplicates</w:t>
+              <w:t>Yinelenenler</w:t>
             </w:r>
           </w:p>
         </w:tc>
         <w:tc>
           <w:tcPr>
-            <w:tcW w:type="dxa" w:w="6860"/>
+            <w:tcW w:type="dxa" w:w="4680"/>
             <w:vAlign w:val="top"/>
           </w:tcPr>
           <w:p>
@@ -1628,7 +1610,7 @@
                 <w:color w:val="000000"/>
                 <w:sz w:val="18"/>
               </w:rPr>
-              <w:t>34,335 exact duplicate rows</w:t>
+              <w:t>Birebir aynı 34.335 satır</w:t>
             </w:r>
           </w:p>
         </w:tc>
@@ -1639,7 +1621,7 @@
         </w:trPr>
         <w:tc>
           <w:tcPr>
-            <w:tcW w:type="dxa" w:w="2500"/>
+            <w:tcW w:type="dxa" w:w="4680"/>
             <w:vAlign w:val="top"/>
           </w:tcPr>
           <w:p>
@@ -1652,13 +1634,13 @@
                 <w:color w:val="000000"/>
                 <w:sz w:val="18"/>
               </w:rPr>
-              <w:t>Eligible purchase evidence</w:t>
+              <w:t>Uygun satın alma</w:t>
             </w:r>
           </w:p>
         </w:tc>
         <w:tc>
           <w:tcPr>
-            <w:tcW w:type="dxa" w:w="6860"/>
+            <w:tcW w:type="dxa" w:w="4680"/>
             <w:vAlign w:val="top"/>
           </w:tcPr>
           <w:p>
@@ -1671,7 +1653,7 @@
                 <w:color w:val="000000"/>
                 <w:sz w:val="18"/>
               </w:rPr>
-              <w:t>805,549 lines; 37,033 purchase events; 5,878 customers</w:t>
+              <w:t>805.549 satır; 37.033 olay; 5.878 müşteri</w:t>
             </w:r>
           </w:p>
         </w:tc>
@@ -1683,17 +1665,8 @@
       </w:pPr>
     </w:p>
     <w:p>
-      <w:pPr>
-        <w:spacing w:before="80" w:after="80"/>
-      </w:pPr>
       <w:r>
-        <w:rPr>
-          <w:rFonts w:ascii="Calibri" w:hAnsi="Calibri"/>
-          <w:i/>
-          <w:color w:val="547068"/>
-          <w:sz w:val="17"/>
-        </w:rPr>
-        <w:t>Evidence class: project-reproduced from external source. Values are generated by scripts/profile_dataset.py.</w:t>
+        <w:t>Kanıt sınıfı: dış kaynaktan projede yeniden üretilmiştir. Değerleri scripts/profile_dataset.py üretir.</w:t>
       </w:r>
     </w:p>
     <w:p>
@@ -1701,7 +1674,7 @@
         <w:pStyle w:val="Heading2"/>
       </w:pPr>
       <w:r>
-        <w:t>4. Quality, privacy and limitations</w:t>
+        <w:t>4. Kalite, gizlilik ve sınırlılıklar</w:t>
       </w:r>
     </w:p>
     <w:p>
@@ -1709,7 +1682,7 @@
         <w:pStyle w:val="AcademicBullet"/>
       </w:pPr>
       <w:r>
-        <w:t>Raw data is checksum-verified and ignored from Git; generated profiles record source URL, DOI, licence, size and SHA-256.</w:t>
+        <w:t>Ham veri sağlama toplamıyla doğrulanır ve Git dışında tutulur; kaynak URL, DOI, lisans, boyut ve SHA-256 kaydedilir.</w:t>
       </w:r>
     </w:p>
     <w:p>
@@ -1717,7 +1690,7 @@
         <w:pStyle w:val="AcademicBullet"/>
       </w:pPr>
       <w:r>
-        <w:t>Modeling excludes exact duplicates, unusable identity/date rows, cancellations and nonpositive purchase lines from eligible purchase events; raw evidence is not overwritten.</w:t>
+        <w:t>Modelleme birebir yinelenenleri, kullanılamayan kimlik/tarihleri, iptalleri ve pozitif olmayan satın alma satırlarını uygun olaylardan çıkarır; ham kanıtı değiştirmez.</w:t>
       </w:r>
     </w:p>
     <w:p>
@@ -1725,7 +1698,7 @@
         <w:pStyle w:val="AcademicBullet"/>
       </w:pPr>
       <w:r>
-        <w:t>Customer IDs are pseudonymous identifiers but still treated as linkable data. Processed customer-level files remain local and ignored; academic outputs contain only aggregates.</w:t>
+        <w:t>Takma adlı müşteri kimlikleri ilişkilendirilebilir veri sayılır. Müşteri düzeyi dosyalar yerelde ve Git dışında; akademik çıktılar topludur.</w:t>
       </w:r>
     </w:p>
     <w:p>
@@ -1733,7 +1706,7 @@
         <w:pStyle w:val="AcademicBullet"/>
       </w:pPr>
       <w:r>
-        <w:t>The source is historical, single-retailer, UK-based and partly wholesale. Missing identifiers and survivor/censoring effects restrict representativeness.</w:t>
+        <w:t>Kaynak tarihsel, tek perakendecili, Birleşik Krallık merkezli ve kısmen toptandır. Eksik kimlik ve sansürleme temsil gücünü sınırlar.</w:t>
       </w:r>
     </w:p>
     <w:p>
@@ -1741,7 +1714,7 @@
         <w:pStyle w:val="Heading2"/>
       </w:pPr>
       <w:r>
-        <w:t>5. Exploratory evidence and marketing insight</w:t>
+        <w:t>5. Keşifsel kanıt ve pazarlama içgörüsü</w:t>
       </w:r>
     </w:p>
     <w:p>
@@ -1752,8 +1725,8 @@
       <w:r>
         <w:drawing>
           <wp:inline xmlns:a="http://schemas.openxmlformats.org/drawingml/2006/main" xmlns:pic="http://schemas.openxmlformats.org/drawingml/2006/picture">
-            <wp:extent cx="5715000" cy="2286000"/>
-            <wp:docPr id="1" name="Picture 1" descr="Figure 1. Training-snapshot inactivity prevalence and recency distribution. Project-generated evidence." title="Figure 1"/>
+            <wp:extent cx="5806440" cy="2322576"/>
+            <wp:docPr id="1" name="Picture 1" descr="Şekil 1. Eğitim anlık görüntülerinde hareketsizlik yaygınlığı ve yakınlık. Projede üretilen kanıt." title="Şekil 1"/>
             <wp:cNvGraphicFramePr>
               <a:graphicFrameLocks noChangeAspect="1"/>
             </wp:cNvGraphicFramePr>
@@ -1773,7 +1746,7 @@
                   <pic:spPr>
                     <a:xfrm>
                       <a:off x="0" y="0"/>
-                      <a:ext cx="5715000" cy="2286000"/>
+                      <a:ext cx="5806440" cy="2322576"/>
                     </a:xfrm>
                     <a:prstGeom prst="rect"/>
                   </pic:spPr>
@@ -1796,7 +1769,7 @@
           <w:color w:val="547068"/>
           <w:sz w:val="18"/>
         </w:rPr>
-        <w:t>Figure 1. Training-snapshot inactivity prevalence and recency distribution. Project-generated evidence.</w:t>
+        <w:t>Şekil 1. Eğitim anlık görüntülerinde hareketsizlik yaygınlığı ve yakınlık. Projede üretilen kanıt.</w:t>
       </w:r>
     </w:p>
     <w:p>
@@ -1807,8 +1780,8 @@
       <w:r>
         <w:drawing>
           <wp:inline xmlns:a="http://schemas.openxmlformats.org/drawingml/2006/main" xmlns:pic="http://schemas.openxmlformats.org/drawingml/2006/picture">
-            <wp:extent cx="5715000" cy="2286000"/>
-            <wp:docPr id="2" name="Picture 2" descr="Figure 2. Training-snapshot frequency and spend behavior. Project-generated evidence." title="Figure 2"/>
+            <wp:extent cx="5806440" cy="2322576"/>
+            <wp:docPr id="2" name="Picture 2" descr="Şekil 2. Eğitim anlık görüntülerinde sıklık ve harcama. Projede üretilen kanıt." title="Şekil 2"/>
             <wp:cNvGraphicFramePr>
               <a:graphicFrameLocks noChangeAspect="1"/>
             </wp:cNvGraphicFramePr>
@@ -1828,7 +1801,7 @@
                   <pic:spPr>
                     <a:xfrm>
                       <a:off x="0" y="0"/>
-                      <a:ext cx="5715000" cy="2286000"/>
+                      <a:ext cx="5806440" cy="2322576"/>
                     </a:xfrm>
                     <a:prstGeom prst="rect"/>
                   </pic:spPr>
@@ -1851,12 +1824,12 @@
           <w:color w:val="547068"/>
           <w:sz w:val="18"/>
         </w:rPr>
-        <w:t>Figure 2. Training-snapshot frequency and spend behavior. Project-generated evidence.</w:t>
+        <w:t>Şekil 2. Eğitim anlık görüntülerinde sıklık ve harcama. Projede üretilen kanıt.</w:t>
       </w:r>
     </w:p>
     <w:p>
       <w:r>
-        <w:t>Median purchases per identified purchase customer are 3; the median observed interpurchase gap is 24.197 days and the 75th percentile is 61.194 days. These aggregates support a 90-day future window as a practical, purchase-cycle-informed inactivity horizon. They do not prove permanent loss. The skewed frequency/spend distributions also support log transformations and robust evaluation rather than raw-scale assumptions.</w:t>
+        <w:t>Tanımlı satın alma müşterisi başına medyan satın alma sayısı 3; satın almalar arası sürenin medyanı 24,197 gün, %75'lik dilimi 61,194 gündür. Bunlar 90 günlük pencereyi uygulanabilir bir hareketsizlik ufku olarak destekler, kalıcı kaybı kanıtlamaz. Çarpık dağılımlar log dönüşümü ve sağlam değerlendirmeyi destekler.</w:t>
       </w:r>
     </w:p>
     <w:p>
@@ -1864,12 +1837,12 @@
         <w:pStyle w:val="Heading2"/>
       </w:pPr>
       <w:r>
-        <w:t>6. Data conclusion</w:t>
+        <w:t>6. Veri sonucu</w:t>
       </w:r>
     </w:p>
     <w:p>
       <w:r>
-        <w:t>Online Retail II is adequate for a reproducible temporal classification study and inadequate for claiming universal churn or campaign causality. Its licensing and provenance are explicit. Production use requires tenant-owned, consent-governed current data and new drift/quality validation.</w:t>
+        <w:t>Online Retail II yeniden üretilebilir zamansal sınıflandırma için yeterli, evrensel kayıp veya kampanya nedenselliği için yetersizdir. Üretim kullanımı kiracıya ait, rıza yönetimli güncel veri ve yeni sapma/kalite doğrulaması gerektirir.</w:t>
       </w:r>
     </w:p>
     <w:p>
@@ -1877,7 +1850,7 @@
         <w:pStyle w:val="Heading1"/>
       </w:pPr>
       <w:r>
-        <w:t>Part III — Technology review</w:t>
+        <w:t>Bölüm III — Teknoloji incelemesi</w:t>
       </w:r>
     </w:p>
     <w:p>
@@ -1885,12 +1858,12 @@
         <w:pStyle w:val="Heading2"/>
       </w:pPr>
       <w:r>
-        <w:t>1. Technology objective and marketing relevance</w:t>
+        <w:t>1. Amaç ve pazarlama ilgisi</w:t>
       </w:r>
     </w:p>
     <w:p>
       <w:r>
-        <w:t>The technology must support ordinary customer operations and auditable intelligence in the same product. The priority is not maximum algorithmic complexity; it is reliable imports, canonical definitions, reproducible training/inference, tenant isolation, useful explanations and controlled actions.</w:t>
+        <w:t>Teknoloji müşteri operasyonlarını ve denetlenebilir zekâyı aynı üründe desteklemelidir. Öncelik algoritmik karmaşıklık değil; güvenilir içe aktarma, standart tanımlar, yeniden üretilebilir eğitim/çıkarım, kiracı yalıtımı, açıklama ve denetimli eylemdir.</w:t>
       </w:r>
     </w:p>
     <w:p>
@@ -1898,7 +1871,7 @@
         <w:pStyle w:val="Heading2"/>
       </w:pPr>
       <w:r>
-        <w:t>2. Comparison</w:t>
+        <w:t>2. Karşılaştırma</w:t>
       </w:r>
     </w:p>
     <w:tbl>
@@ -1911,10 +1884,10 @@
         <w:tblInd w:w="120" w:type="dxa"/>
       </w:tblPr>
       <w:tblGrid>
-        <w:gridCol w:w="1300"/>
-        <w:gridCol w:w="1900"/>
-        <w:gridCol w:w="3200"/>
-        <w:gridCol w:w="2960"/>
+        <w:gridCol w:w="2340"/>
+        <w:gridCol w:w="2340"/>
+        <w:gridCol w:w="2340"/>
+        <w:gridCol w:w="2340"/>
       </w:tblGrid>
       <w:tr>
         <w:trPr>
@@ -1923,7 +1896,7 @@
         </w:trPr>
         <w:tc>
           <w:tcPr>
-            <w:tcW w:type="dxa" w:w="1300"/>
+            <w:tcW w:type="dxa" w:w="2340"/>
             <w:tcMar>
               <w:top w:w="80" w:type="dxa"/>
               <w:start w:w="120" w:type="dxa"/>
@@ -1944,13 +1917,13 @@
                 <w:color w:val="173B32"/>
                 <w:sz w:val="19"/>
               </w:rPr>
-              <w:t>Area</w:t>
+              <w:t>Alan</w:t>
             </w:r>
           </w:p>
         </w:tc>
         <w:tc>
           <w:tcPr>
-            <w:tcW w:type="dxa" w:w="1900"/>
+            <w:tcW w:type="dxa" w:w="2340"/>
             <w:tcMar>
               <w:top w:w="80" w:type="dxa"/>
               <w:start w:w="120" w:type="dxa"/>
@@ -1971,13 +1944,13 @@
                 <w:color w:val="173B32"/>
                 <w:sz w:val="19"/>
               </w:rPr>
-              <w:t>Selected technology</w:t>
+              <w:t>Seçilen teknoloji</w:t>
             </w:r>
           </w:p>
         </w:tc>
         <w:tc>
           <w:tcPr>
-            <w:tcW w:type="dxa" w:w="3200"/>
+            <w:tcW w:type="dxa" w:w="2340"/>
             <w:tcMar>
               <w:top w:w="80" w:type="dxa"/>
               <w:start w:w="120" w:type="dxa"/>
@@ -1998,13 +1971,13 @@
                 <w:color w:val="173B32"/>
                 <w:sz w:val="19"/>
               </w:rPr>
-              <w:t>Why selected</w:t>
+              <w:t>Neden</w:t>
             </w:r>
           </w:p>
         </w:tc>
         <w:tc>
           <w:tcPr>
-            <w:tcW w:type="dxa" w:w="2960"/>
+            <w:tcW w:type="dxa" w:w="2340"/>
             <w:tcMar>
               <w:top w:w="80" w:type="dxa"/>
               <w:start w:w="120" w:type="dxa"/>
@@ -2025,7 +1998,7 @@
                 <w:color w:val="173B32"/>
                 <w:sz w:val="19"/>
               </w:rPr>
-              <w:t>Trade-off / control</w:t>
+              <w:t>Ödünleşim / kontrol</w:t>
             </w:r>
           </w:p>
         </w:tc>
@@ -2036,7 +2009,7 @@
         </w:trPr>
         <w:tc>
           <w:tcPr>
-            <w:tcW w:type="dxa" w:w="1300"/>
+            <w:tcW w:type="dxa" w:w="2340"/>
             <w:vAlign w:val="top"/>
           </w:tcPr>
           <w:p>
@@ -2049,13 +2022,13 @@
                 <w:color w:val="000000"/>
                 <w:sz w:val="18"/>
               </w:rPr>
-              <w:t>API/domain</w:t>
+              <w:t>API/alan</w:t>
             </w:r>
           </w:p>
         </w:tc>
         <w:tc>
           <w:tcPr>
-            <w:tcW w:type="dxa" w:w="1900"/>
+            <w:tcW w:type="dxa" w:w="2340"/>
             <w:vAlign w:val="top"/>
           </w:tcPr>
           <w:p>
@@ -2074,7 +2047,7 @@
         </w:tc>
         <w:tc>
           <w:tcPr>
-            <w:tcW w:type="dxa" w:w="3200"/>
+            <w:tcW w:type="dxa" w:w="2340"/>
             <w:vAlign w:val="top"/>
           </w:tcPr>
           <w:p>
@@ -2087,13 +2060,13 @@
                 <w:color w:val="000000"/>
                 <w:sz w:val="18"/>
               </w:rPr>
-              <w:t>Typed validation, OpenAPI, shared ML ecosystem</w:t>
+              <w:t>Tür kontrollü doğrulama, OpenAPI, ML ekosistemi</w:t>
             </w:r>
           </w:p>
         </w:tc>
         <w:tc>
           <w:tcPr>
-            <w:tcW w:type="dxa" w:w="2960"/>
+            <w:tcW w:type="dxa" w:w="2340"/>
             <w:vAlign w:val="top"/>
           </w:tcPr>
           <w:p>
@@ -2106,7 +2079,7 @@
                 <w:color w:val="000000"/>
                 <w:sz w:val="18"/>
               </w:rPr>
-              <w:t>Modular-monolith discipline and strict typing required</w:t>
+              <w:t>Modüler tek parça ve katı tür disiplini</w:t>
             </w:r>
           </w:p>
         </w:tc>
@@ -2117,7 +2090,7 @@
         </w:trPr>
         <w:tc>
           <w:tcPr>
-            <w:tcW w:type="dxa" w:w="1300"/>
+            <w:tcW w:type="dxa" w:w="2340"/>
             <w:vAlign w:val="top"/>
           </w:tcPr>
           <w:p>
@@ -2130,13 +2103,13 @@
                 <w:color w:val="000000"/>
                 <w:sz w:val="18"/>
               </w:rPr>
-              <w:t>Database/tenancy</w:t>
+              <w:t>Veri/kiracılık</w:t>
             </w:r>
           </w:p>
         </w:tc>
         <w:tc>
           <w:tcPr>
-            <w:tcW w:type="dxa" w:w="1900"/>
+            <w:tcW w:type="dxa" w:w="2340"/>
             <w:vAlign w:val="top"/>
           </w:tcPr>
           <w:p>
@@ -2155,7 +2128,7 @@
         </w:tc>
         <w:tc>
           <w:tcPr>
-            <w:tcW w:type="dxa" w:w="3200"/>
+            <w:tcW w:type="dxa" w:w="2340"/>
             <w:vAlign w:val="top"/>
           </w:tcPr>
           <w:p>
@@ -2168,13 +2141,13 @@
                 <w:color w:val="000000"/>
                 <w:sz w:val="18"/>
               </w:rPr>
-              <w:t>Transactions, constraints, analytics and row-level tenant policy</w:t>
+              <w:t>İşlem, kısıt, analitik, satır politikası</w:t>
             </w:r>
           </w:p>
         </w:tc>
         <w:tc>
           <w:tcPr>
-            <w:tcW w:type="dxa" w:w="2960"/>
+            <w:tcW w:type="dxa" w:w="2340"/>
             <w:vAlign w:val="top"/>
           </w:tcPr>
           <w:p>
@@ -2187,7 +2160,7 @@
                 <w:color w:val="000000"/>
                 <w:sz w:val="18"/>
               </w:rPr>
-              <w:t>RLS is defense-in-depth; application scope tests still required</w:t>
+              <w:t>Uygulama kapsam testleri yine gerekir</w:t>
             </w:r>
           </w:p>
         </w:tc>
@@ -2198,7 +2171,7 @@
         </w:trPr>
         <w:tc>
           <w:tcPr>
-            <w:tcW w:type="dxa" w:w="1300"/>
+            <w:tcW w:type="dxa" w:w="2340"/>
             <w:vAlign w:val="top"/>
           </w:tcPr>
           <w:p>
@@ -2217,7 +2190,7 @@
         </w:tc>
         <w:tc>
           <w:tcPr>
-            <w:tcW w:type="dxa" w:w="1900"/>
+            <w:tcW w:type="dxa" w:w="2340"/>
             <w:vAlign w:val="top"/>
           </w:tcPr>
           <w:p>
@@ -2230,13 +2203,13 @@
                 <w:color w:val="000000"/>
                 <w:sz w:val="18"/>
               </w:rPr>
-              <w:t>Next.js, React, strict TypeScript</w:t>
+              <w:t>Next.js, React, katı TypeScript</w:t>
             </w:r>
           </w:p>
         </w:tc>
         <w:tc>
           <w:tcPr>
-            <w:tcW w:type="dxa" w:w="3200"/>
+            <w:tcW w:type="dxa" w:w="2340"/>
             <w:vAlign w:val="top"/>
           </w:tcPr>
           <w:p>
@@ -2249,13 +2222,13 @@
                 <w:color w:val="000000"/>
                 <w:sz w:val="18"/>
               </w:rPr>
-              <w:t>Server-rendered operator UI and typed boundaries</w:t>
+              <w:t>Sunucu işleme ve tür kontrollü sınırlar</w:t>
             </w:r>
           </w:p>
         </w:tc>
         <w:tc>
           <w:tcPr>
-            <w:tcW w:type="dxa" w:w="2960"/>
+            <w:tcW w:type="dxa" w:w="2340"/>
             <w:vAlign w:val="top"/>
           </w:tcPr>
           <w:p>
@@ -2268,7 +2241,7 @@
                 <w:color w:val="000000"/>
                 <w:sz w:val="18"/>
               </w:rPr>
-              <w:t>Automated desktop/mobile Chromium and Axe checks pass; manual multi-browser and assistive-technology review remains external</w:t>
+              <w:t>Otomasyon geçer; manuel tarayıcı/yardımcı teknoloji incelemesi bekler</w:t>
             </w:r>
           </w:p>
         </w:tc>
@@ -2279,7 +2252,7 @@
         </w:trPr>
         <w:tc>
           <w:tcPr>
-            <w:tcW w:type="dxa" w:w="1300"/>
+            <w:tcW w:type="dxa" w:w="2340"/>
             <w:vAlign w:val="top"/>
           </w:tcPr>
           <w:p>
@@ -2292,13 +2265,13 @@
                 <w:color w:val="000000"/>
                 <w:sz w:val="18"/>
               </w:rPr>
-              <w:t>Jobs</w:t>
+              <w:t>İşler</w:t>
             </w:r>
           </w:p>
         </w:tc>
         <w:tc>
           <w:tcPr>
-            <w:tcW w:type="dxa" w:w="1900"/>
+            <w:tcW w:type="dxa" w:w="2340"/>
             <w:vAlign w:val="top"/>
           </w:tcPr>
           <w:p>
@@ -2311,13 +2284,13 @@
                 <w:color w:val="000000"/>
                 <w:sz w:val="18"/>
               </w:rPr>
-              <w:t>Redis, Dramatiq, transactional outbox</w:t>
+              <w:t>Redis, Dramatiq, işlemsel outbox</w:t>
             </w:r>
           </w:p>
         </w:tc>
         <w:tc>
           <w:tcPr>
-            <w:tcW w:type="dxa" w:w="3200"/>
+            <w:tcW w:type="dxa" w:w="2340"/>
             <w:vAlign w:val="top"/>
           </w:tcPr>
           <w:p>
@@ -2330,13 +2303,13 @@
                 <w:color w:val="000000"/>
                 <w:sz w:val="18"/>
               </w:rPr>
-              <w:t>Durable async imports/sync/scoring with retries</w:t>
+              <w:t>Kalıcı ve yeniden denemeli işler</w:t>
             </w:r>
           </w:p>
         </w:tc>
         <w:tc>
           <w:tcPr>
-            <w:tcW w:type="dxa" w:w="2960"/>
+            <w:tcW w:type="dxa" w:w="2340"/>
             <w:vAlign w:val="top"/>
           </w:tcPr>
           <w:p>
@@ -2349,7 +2322,7 @@
                 <w:color w:val="000000"/>
                 <w:sz w:val="18"/>
               </w:rPr>
-              <w:t>Operational monitoring and managed Redis needed</w:t>
+              <w:t>İzleme ve yönetilen Redis gerekir</w:t>
             </w:r>
           </w:p>
         </w:tc>
@@ -2360,7 +2333,7 @@
         </w:trPr>
         <w:tc>
           <w:tcPr>
-            <w:tcW w:type="dxa" w:w="1300"/>
+            <w:tcW w:type="dxa" w:w="2340"/>
             <w:vAlign w:val="top"/>
           </w:tcPr>
           <w:p>
@@ -2373,13 +2346,13 @@
                 <w:color w:val="000000"/>
                 <w:sz w:val="18"/>
               </w:rPr>
-              <w:t>Modeling</w:t>
+              <w:t>Modelleme</w:t>
             </w:r>
           </w:p>
         </w:tc>
         <w:tc>
           <w:tcPr>
-            <w:tcW w:type="dxa" w:w="1900"/>
+            <w:tcW w:type="dxa" w:w="2340"/>
             <w:vAlign w:val="top"/>
           </w:tcPr>
           <w:p>
@@ -2392,13 +2365,13 @@
                 <w:color w:val="000000"/>
                 <w:sz w:val="18"/>
               </w:rPr>
-              <w:t>scikit-learn + LightGBM candidates</w:t>
+              <w:t>scikit-learn + LightGBM</w:t>
             </w:r>
           </w:p>
         </w:tc>
         <w:tc>
           <w:tcPr>
-            <w:tcW w:type="dxa" w:w="3200"/>
+            <w:tcW w:type="dxa" w:w="2340"/>
             <w:vAlign w:val="top"/>
           </w:tcPr>
           <w:p>
@@ -2411,13 +2384,13 @@
                 <w:color w:val="000000"/>
                 <w:sz w:val="18"/>
               </w:rPr>
-              <w:t>Transparent pipelines plus nonlinear challenger</w:t>
+              <w:t>Şeffaf hat ve doğrusal olmayan aday</w:t>
             </w:r>
           </w:p>
         </w:tc>
         <w:tc>
           <w:tcPr>
-            <w:tcW w:type="dxa" w:w="2960"/>
+            <w:tcW w:type="dxa" w:w="2340"/>
             <w:vAlign w:val="top"/>
           </w:tcPr>
           <w:p>
@@ -2430,7 +2403,7 @@
                 <w:color w:val="000000"/>
                 <w:sz w:val="18"/>
               </w:rPr>
-              <w:t>Validation chose regularized logistic regression, not assumed LightGBM</w:t>
+              <w:t>Doğrulama lojistik regresyonu seçti</w:t>
             </w:r>
           </w:p>
         </w:tc>
@@ -2441,7 +2414,7 @@
         </w:trPr>
         <w:tc>
           <w:tcPr>
-            <w:tcW w:type="dxa" w:w="1300"/>
+            <w:tcW w:type="dxa" w:w="2340"/>
             <w:vAlign w:val="top"/>
           </w:tcPr>
           <w:p>
@@ -2454,13 +2427,13 @@
                 <w:color w:val="000000"/>
                 <w:sz w:val="18"/>
               </w:rPr>
-              <w:t>Tracking</w:t>
+              <w:t>İzleme</w:t>
             </w:r>
           </w:p>
         </w:tc>
         <w:tc>
           <w:tcPr>
-            <w:tcW w:type="dxa" w:w="1900"/>
+            <w:tcW w:type="dxa" w:w="2340"/>
             <w:vAlign w:val="top"/>
           </w:tcPr>
           <w:p>
@@ -2479,7 +2452,7 @@
         </w:tc>
         <w:tc>
           <w:tcPr>
-            <w:tcW w:type="dxa" w:w="3200"/>
+            <w:tcW w:type="dxa" w:w="2340"/>
             <w:vAlign w:val="top"/>
           </w:tcPr>
           <w:p>
@@ -2492,13 +2465,13 @@
                 <w:color w:val="000000"/>
                 <w:sz w:val="18"/>
               </w:rPr>
-              <w:t>Run, parameter, metric and artifact provenance</w:t>
+              <w:t>Çalıştırma, parametre, ölçüt ve eser kaynağı</w:t>
             </w:r>
           </w:p>
         </w:tc>
         <w:tc>
           <w:tcPr>
-            <w:tcW w:type="dxa" w:w="2960"/>
+            <w:tcW w:type="dxa" w:w="2340"/>
             <w:vAlign w:val="top"/>
           </w:tcPr>
           <w:p>
@@ -2511,7 +2484,7 @@
                 <w:color w:val="000000"/>
                 <w:sz w:val="18"/>
               </w:rPr>
-              <w:t>Local registry is not a production registry service</w:t>
+              <w:t>Yerel kayıt üretim hizmeti değildir</w:t>
             </w:r>
           </w:p>
         </w:tc>
@@ -2522,7 +2495,7 @@
         </w:trPr>
         <w:tc>
           <w:tcPr>
-            <w:tcW w:type="dxa" w:w="1300"/>
+            <w:tcW w:type="dxa" w:w="2340"/>
             <w:vAlign w:val="top"/>
           </w:tcPr>
           <w:p>
@@ -2535,13 +2508,13 @@
                 <w:color w:val="000000"/>
                 <w:sz w:val="18"/>
               </w:rPr>
-              <w:t>Explanation</w:t>
+              <w:t>Açıklama</w:t>
             </w:r>
           </w:p>
         </w:tc>
         <w:tc>
           <w:tcPr>
-            <w:tcW w:type="dxa" w:w="1900"/>
+            <w:tcW w:type="dxa" w:w="2340"/>
             <w:vAlign w:val="top"/>
           </w:tcPr>
           <w:p>
@@ -2554,13 +2527,13 @@
                 <w:color w:val="000000"/>
                 <w:sz w:val="18"/>
               </w:rPr>
-              <w:t>SHAP + logistic coefficients</w:t>
+              <w:t>SHAP + katsayılar</w:t>
             </w:r>
           </w:p>
         </w:tc>
         <w:tc>
           <w:tcPr>
-            <w:tcW w:type="dxa" w:w="3200"/>
+            <w:tcW w:type="dxa" w:w="2340"/>
             <w:vAlign w:val="top"/>
           </w:tcPr>
           <w:p>
@@ -2573,13 +2546,13 @@
                 <w:color w:val="000000"/>
                 <w:sz w:val="18"/>
               </w:rPr>
-              <w:t>Local/global score decomposition</w:t>
+              <w:t>Yerel/küresel puan ayrıştırması</w:t>
             </w:r>
           </w:p>
         </w:tc>
         <w:tc>
           <w:tcPr>
-            <w:tcW w:type="dxa" w:w="2960"/>
+            <w:tcW w:type="dxa" w:w="2340"/>
             <w:vAlign w:val="top"/>
           </w:tcPr>
           <w:p>
@@ -2592,7 +2565,7 @@
                 <w:color w:val="000000"/>
                 <w:sz w:val="18"/>
               </w:rPr>
-              <w:t>Not causal; categorical encoding and correlated features complicate interpretation</w:t>
+              <w:t>Nedensel değildir</w:t>
             </w:r>
           </w:p>
         </w:tc>
@@ -2603,7 +2576,7 @@
         </w:trPr>
         <w:tc>
           <w:tcPr>
-            <w:tcW w:type="dxa" w:w="1300"/>
+            <w:tcW w:type="dxa" w:w="2340"/>
             <w:vAlign w:val="top"/>
           </w:tcPr>
           <w:p>
@@ -2616,13 +2589,13 @@
                 <w:color w:val="000000"/>
                 <w:sz w:val="18"/>
               </w:rPr>
-              <w:t>Deployment</w:t>
+              <w:t>Dağıtım</w:t>
             </w:r>
           </w:p>
         </w:tc>
         <w:tc>
           <w:tcPr>
-            <w:tcW w:type="dxa" w:w="1900"/>
+            <w:tcW w:type="dxa" w:w="2340"/>
             <w:vAlign w:val="top"/>
           </w:tcPr>
           <w:p>
@@ -2635,13 +2608,13 @@
                 <w:color w:val="000000"/>
                 <w:sz w:val="18"/>
               </w:rPr>
-              <w:t>Containers + Terraform AWS reference</w:t>
+              <w:t>Kapsayıcılar + Terraform AWS</w:t>
             </w:r>
           </w:p>
         </w:tc>
         <w:tc>
           <w:tcPr>
-            <w:tcW w:type="dxa" w:w="3200"/>
+            <w:tcW w:type="dxa" w:w="2340"/>
             <w:vAlign w:val="top"/>
           </w:tcPr>
           <w:p>
@@ -2654,13 +2627,13 @@
                 <w:color w:val="000000"/>
                 <w:sz w:val="18"/>
               </w:rPr>
-              <w:t>Portable local-to-cloud boundary</w:t>
+              <w:t>Taşınabilir sınır</w:t>
             </w:r>
           </w:p>
         </w:tc>
         <w:tc>
           <w:tcPr>
-            <w:tcW w:type="dxa" w:w="2960"/>
+            <w:tcW w:type="dxa" w:w="2340"/>
             <w:vAlign w:val="top"/>
           </w:tcPr>
           <w:p>
@@ -2673,7 +2646,7 @@
                 <w:color w:val="000000"/>
                 <w:sz w:val="18"/>
               </w:rPr>
-              <w:t>Paid cloud deployment and restore drills remain external</w:t>
+              <w:t>Ücretli bulut ve geri yükleme testleri bekler</w:t>
             </w:r>
           </w:p>
         </w:tc>
@@ -2685,17 +2658,8 @@
       </w:pPr>
     </w:p>
     <w:p>
-      <w:pPr>
-        <w:spacing w:before="80" w:after="80"/>
-      </w:pPr>
       <w:r>
-        <w:rPr>
-          <w:rFonts w:ascii="Calibri" w:hAnsi="Calibri"/>
-          <w:i/>
-          <w:color w:val="547068"/>
-          <w:sz w:val="17"/>
-        </w:rPr>
-        <w:t>Performance and cost conclusions are architectural assessments, not benchmark claims. Live provider latency/cost was not measured.</w:t>
+        <w:t>Performans ve maliyet değerlendirmeleri kıyaslama iddiası değildir; canlı sağlayıcı gecikmesi/maliyeti ölçülmemiştir.</w:t>
       </w:r>
     </w:p>
     <w:p>
@@ -2703,12 +2667,7 @@
         <w:pStyle w:val="Heading2"/>
       </w:pPr>
       <w:r>
-        <w:t>3. Industry examples and project use cases</w:t>
-      </w:r>
-    </w:p>
-    <w:p>
-      <w:r>
-        <w:t>The following external-source examples show how established platforms place machine learning inside marketing operations. They document product capabilities, not outcomes achieved by GrowthPilot.</w:t>
+        <w:t>3. Sektör örnekleri ve kullanım alanları</w:t>
       </w:r>
     </w:p>
     <w:tbl>
@@ -2721,9 +2680,9 @@
         <w:tblInd w:w="120" w:type="dxa"/>
       </w:tblPr>
       <w:tblGrid>
-        <w:gridCol w:w="1800"/>
-        <w:gridCol w:w="3700"/>
-        <w:gridCol w:w="3860"/>
+        <w:gridCol w:w="3120"/>
+        <w:gridCol w:w="3120"/>
+        <w:gridCol w:w="3120"/>
       </w:tblGrid>
       <w:tr>
         <w:trPr>
@@ -2732,7 +2691,7 @@
         </w:trPr>
         <w:tc>
           <w:tcPr>
-            <w:tcW w:type="dxa" w:w="1800"/>
+            <w:tcW w:type="dxa" w:w="3120"/>
             <w:tcMar>
               <w:top w:w="80" w:type="dxa"/>
               <w:start w:w="120" w:type="dxa"/>
@@ -2753,13 +2712,13 @@
                 <w:color w:val="173B32"/>
                 <w:sz w:val="19"/>
               </w:rPr>
-              <w:t>External product</w:t>
+              <w:t>Harici ürün</w:t>
             </w:r>
           </w:p>
         </w:tc>
         <w:tc>
           <w:tcPr>
-            <w:tcW w:type="dxa" w:w="3700"/>
+            <w:tcW w:type="dxa" w:w="3120"/>
             <w:tcMar>
               <w:top w:w="80" w:type="dxa"/>
               <w:start w:w="120" w:type="dxa"/>
@@ -2780,13 +2739,13 @@
                 <w:color w:val="173B32"/>
                 <w:sz w:val="19"/>
               </w:rPr>
-              <w:t>Marketing use / evidence</w:t>
+              <w:t>Pazarlama kullanımı</w:t>
             </w:r>
           </w:p>
         </w:tc>
         <w:tc>
           <w:tcPr>
-            <w:tcW w:type="dxa" w:w="3860"/>
+            <w:tcW w:type="dxa" w:w="3120"/>
             <w:tcMar>
               <w:top w:w="80" w:type="dxa"/>
               <w:start w:w="120" w:type="dxa"/>
@@ -2807,7 +2766,7 @@
                 <w:color w:val="173B32"/>
                 <w:sz w:val="19"/>
               </w:rPr>
-              <w:t>Lesson for GrowthPilot</w:t>
+              <w:t>GrowthPilot için ders</w:t>
             </w:r>
           </w:p>
         </w:tc>
@@ -2818,7 +2777,7 @@
         </w:trPr>
         <w:tc>
           <w:tcPr>
-            <w:tcW w:type="dxa" w:w="1800"/>
+            <w:tcW w:type="dxa" w:w="3120"/>
             <w:vAlign w:val="top"/>
           </w:tcPr>
           <w:p>
@@ -2837,7 +2796,7 @@
         </w:tc>
         <w:tc>
           <w:tcPr>
-            <w:tcW w:type="dxa" w:w="3700"/>
+            <w:tcW w:type="dxa" w:w="3120"/>
             <w:vAlign w:val="top"/>
           </w:tcPr>
           <w:p>
@@ -2850,13 +2809,13 @@
                 <w:color w:val="000000"/>
                 <w:sz w:val="18"/>
               </w:rPr>
-              <w:t>Analyzes historical lead-conversion patterns to prioritize current leads and exposes influential fields in CRM views.</w:t>
+              <w:t>Geçmiş dönüşüm örüntüleriyle adayları önceliklendirir ve etkili alanları CRM'de gösterir</w:t>
             </w:r>
           </w:p>
         </w:tc>
         <w:tc>
           <w:tcPr>
-            <w:tcW w:type="dxa" w:w="3860"/>
+            <w:tcW w:type="dxa" w:w="3120"/>
             <w:vAlign w:val="top"/>
           </w:tcPr>
           <w:p>
@@ -2869,7 +2828,7 @@
                 <w:color w:val="000000"/>
                 <w:sz w:val="18"/>
               </w:rPr>
-              <w:t>A score becomes operationally useful when it appears in the user's workflow with an explanation; vendor capability is not GrowthPilot outcome evidence.</w:t>
+              <w:t>Puan açıklamayla iş akışında olmalıdır; sağlayıcı yeteneği GrowthPilot sonucu değildir</w:t>
             </w:r>
           </w:p>
         </w:tc>
@@ -2880,7 +2839,7 @@
         </w:trPr>
         <w:tc>
           <w:tcPr>
-            <w:tcW w:type="dxa" w:w="1800"/>
+            <w:tcW w:type="dxa" w:w="3120"/>
             <w:vAlign w:val="top"/>
           </w:tcPr>
           <w:p>
@@ -2899,7 +2858,7 @@
         </w:tc>
         <w:tc>
           <w:tcPr>
-            <w:tcW w:type="dxa" w:w="3700"/>
+            <w:tcW w:type="dxa" w:w="3120"/>
             <w:vAlign w:val="top"/>
           </w:tcPr>
           <w:p>
@@ -2912,13 +2871,13 @@
                 <w:color w:val="000000"/>
                 <w:sz w:val="18"/>
               </w:rPr>
-              <w:t>Uses Google AI for auction-time bidding toward conversions or conversion value; it depends on conversion tracking and may depend on historical conversion volume.</w:t>
+              <w:t>Dönüşüm/değer için açık artırma anında Google AI kullanır; ölçüme dayanır</w:t>
             </w:r>
           </w:p>
         </w:tc>
         <w:tc>
           <w:tcPr>
-            <w:tcW w:type="dxa" w:w="3860"/>
+            <w:tcW w:type="dxa" w:w="3120"/>
             <w:vAlign w:val="top"/>
           </w:tcPr>
           <w:p>
@@ -2931,7 +2890,7 @@
                 <w:color w:val="000000"/>
                 <w:sz w:val="18"/>
               </w:rPr>
-              <w:t>Optimization quality depends on measurement and provider data. GrowthPilot therefore keeps provider execution separate from first-party decision governance.</w:t>
+              <w:t>Optimizasyon ölçüm ve sağlayıcı verisine bağlıdır; yürütme karar yönetişiminden ayrılmalıdır</w:t>
             </w:r>
           </w:p>
         </w:tc>
@@ -2943,17 +2902,8 @@
       </w:pPr>
     </w:p>
     <w:p>
-      <w:pPr>
-        <w:spacing w:before="80" w:after="80"/>
-      </w:pPr>
       <w:r>
-        <w:rPr>
-          <w:rFonts w:ascii="Calibri" w:hAnsi="Calibri"/>
-          <w:i/>
-          <w:color w:val="547068"/>
-          <w:sz w:val="17"/>
-        </w:rPr>
-        <w:t>External-source capability examples. No vendor performance claim or GrowthPilot business outcome is asserted.</w:t>
+        <w:t>Dış kaynak yetenek örnekleridir; sağlayıcı performansı veya GrowthPilot iş sonucu iddia edilmez.</w:t>
       </w:r>
     </w:p>
     <w:p>
@@ -2961,7 +2911,7 @@
         <w:pStyle w:val="Heading3"/>
       </w:pPr>
       <w:r>
-        <w:t>GrowthPilot application</w:t>
+        <w:t>GrowthPilot uygulaması</w:t>
       </w:r>
     </w:p>
     <w:p>
@@ -2969,7 +2919,7 @@
         <w:pStyle w:val="AcademicBullet"/>
       </w:pPr>
       <w:r>
-        <w:t>Customer 360: orders, value, RFM segment, predictions and consent in one tenant-scoped view.</w:t>
+        <w:t>Müşteri 360: sipariş, değer, RFM, tahmin ve rıza tek kiracı görünümünde.</w:t>
       </w:r>
     </w:p>
     <w:p>
@@ -2977,7 +2927,7 @@
         <w:pStyle w:val="AcademicBullet"/>
       </w:pPr>
       <w:r>
-        <w:t>Capacity-aware retention review: sort customers by calibrated inactivity risk and commercial importance, then require approval.</w:t>
+        <w:t>Kapasiteye duyarlı elde tutma: risk ve ticari öneme göre sıralama, ardından zorunlu onay.</w:t>
       </w:r>
     </w:p>
     <w:p>
@@ -2985,7 +2935,7 @@
         <w:pStyle w:val="AcademicBullet"/>
       </w:pPr>
       <w:r>
-        <w:t>Operational analytics: versioned revenue/order/customer/inventory metrics with explicit null states when data is unavailable.</w:t>
+        <w:t>Operasyonel analitik: sürümlü ölçütler ve veri yoksa açık boş durumlar.</w:t>
       </w:r>
     </w:p>
     <w:p>
@@ -2993,7 +2943,7 @@
         <w:pStyle w:val="AcademicBullet"/>
       </w:pPr>
       <w:r>
-        <w:t>Provider-neutral marketing ingestion: bounded raw payload provenance and canonical daily facts through fixed-origin adapters.</w:t>
+        <w:t>Sağlayıcıdan bağımsız alım: sabit kökenli bağdaştırıcılarla ham yük kaynağı ve standart günlük gerçekler.</w:t>
       </w:r>
     </w:p>
     <w:p>
@@ -3001,12 +2951,12 @@
         <w:pStyle w:val="Heading2"/>
       </w:pPr>
       <w:r>
-        <w:t>4. Limitations and opportunities</w:t>
+        <w:t>4. Sınırlılıklar ve fırsatlar</w:t>
       </w:r>
     </w:p>
     <w:p>
       <w:r>
-        <w:t>No live Meta, Google Ads, OIDC, LLM or cloud credentials were supplied; these boundaries are implemented and mock-tested but not live-validated. The local MLflow registry and single historical dataset do not establish production robustness. Next work after review should include credentialed sandbox validation, load/resilience tests, manual multi-browser and assistive-technology review, managed backup/restore rehearsal and monitoring thresholds based on real operating data.</w:t>
+        <w:t>Canlı Meta, Google Ads, OIDC, LLM veya bulut kimlik bilgileri yoktur; sınırlar uygulanıp taklitle test edilmiş, canlı doğrulanmamıştır. Yerel MLflow ve tek tarihsel veri kümesi üretim sağlamlığını kanıtlamaz. Sonraki işler kimlik bilgili test ortamı, yük/dayanıklılık, manuel tarayıcı/yardımcı teknoloji, yedekleme/geri yükleme ve gerçek veriye dayalı izleme doğrulamasıdır.</w:t>
       </w:r>
     </w:p>
     <w:p>
@@ -3014,12 +2964,12 @@
         <w:pStyle w:val="Heading2"/>
       </w:pPr>
       <w:r>
-        <w:t>5. Technology conclusion</w:t>
+        <w:t>5. Teknoloji sonucu</w:t>
       </w:r>
     </w:p>
     <w:p>
       <w:r>
-        <w:t>The stack is appropriate because it makes the capstone reproducible without separating the evidence pipeline from product controls. It remains a production-oriented local implementation, not a production deployment.</w:t>
+        <w:t>Yığın, kanıt işlem hattını ürün denetimlerinden ayırmadan yeniden üretilebilirlik sağlar. Bu üretime yönelik yerel uygulamadır, üretim dağıtımı değildir.</w:t>
       </w:r>
     </w:p>
     <w:p>
@@ -3027,7 +2977,7 @@
         <w:pStyle w:val="Heading1"/>
       </w:pPr>
       <w:r>
-        <w:t>References</w:t>
+        <w:t>Kaynakça</w:t>
       </w:r>
     </w:p>
     <w:p>
@@ -3037,7 +2987,7 @@
     </w:p>
     <w:p>
       <w:r>
-        <w:t>Chen, D. (2012). Online Retail II [Dataset]. UCI Machine Learning Repository. https://doi.org/10.24432/C5CG6D</w:t>
+        <w:t>Chen, D. (2012). Online Retail II [Veri kümesi]. UCI Machine Learning Repository. https://doi.org/10.24432/C5CG6D</w:t>
       </w:r>
     </w:p>
     <w:p>
@@ -3062,17 +3012,17 @@
     </w:p>
     <w:p>
       <w:r>
-        <w:t>Salesforce. (n.d.). Einstein Lead Scoring. Salesforce Help. https://help.salesforce.com/s/articleView?id=einstein_sales_lead_insights.htm&amp;language=en_US. Accessed 11 September 2026.</w:t>
+        <w:t>Salesforce. (t.y.). Einstein Lead Scoring. Salesforce Help. https://help.salesforce.com/s/articleView?id=einstein_sales_lead_insights.htm&amp;language=en_US. Erişim: 11 Eylül 2026.</w:t>
       </w:r>
     </w:p>
     <w:p>
       <w:r>
-        <w:t>Google Ads Help. (n.d.). About Smart Bidding. https://support.google.com/google-ads/answer/7065882?hl=en. Accessed 11 September 2026.</w:t>
+        <w:t>Google Ads Help. (t.y.). About Smart Bidding. https://support.google.com/google-ads/answer/7065882?hl=en. Erişim: 11 Eylül 2026.</w:t>
       </w:r>
     </w:p>
     <w:p>
       <w:r>
-        <w:t>Technology documentation: PostgreSQL row security; scikit-learn model evaluation and calibration; LightGBM Python API; SHAP documentation; MLflow tracking; FastAPI security; Next.js App Router. Accessed 8–9 September 2026; URLs are recorded in repository ADRs and research notes.</w:t>
+        <w:t>Teknoloji belgeleri: PostgreSQL satır güvenliği; scikit-learn değerlendirme/kalibrasyon; LightGBM Python API; SHAP; MLflow; FastAPI güvenliği; Next.js App Router. URL'ler depo ADR'lerinde ve araştırma notlarında kayıtlıdır.</w:t>
       </w:r>
     </w:p>
     <w:sectPr>
@@ -3101,7 +3051,7 @@
         <w:color w:val="547068"/>
         <w:sz w:val="17"/>
       </w:rPr>
-      <w:t xml:space="preserve">Page </w:t>
+      <w:t xml:space="preserve">Sayfa </w:t>
     </w:r>
     <w:r>
       <w:rPr>
@@ -3120,7 +3070,7 @@
         <w:color w:val="547068"/>
         <w:sz w:val="17"/>
       </w:rPr>
-      <w:t xml:space="preserve"> of </w:t>
+      <w:t xml:space="preserve"> / </w:t>
     </w:r>
     <w:r>
       <w:rPr>
@@ -3155,7 +3105,7 @@
         <w:color w:val="547068"/>
         <w:sz w:val="17"/>
       </w:rPr>
-      <w:t>GROWTHPILOT AI  |  LITERATURE, DATA AND TECHNOLOGY SUBMISSION</w:t>
+      <w:t>GROWTHPILOT AI  |  LITERATÜR, VERI VE TEKNOLOJI ÇALIŞMASI</w:t>
     </w:r>
   </w:p>
 </w:hdr>

</xml_diff>

<commit_message>
docs: complete final assignment and project audit
</commit_message>
<xml_diff>
--- a/academic/submissions/01_Literature_Data_Technology_Submission.docx
+++ b/academic/submissions/01_Literature_Data_Technology_Submission.docx
@@ -2712,7 +2712,7 @@
                 <w:color w:val="173B32"/>
                 <w:sz w:val="19"/>
               </w:rPr>
-              <w:t>Harici ürün</w:t>
+              <w:t>Harici örnek</w:t>
             </w:r>
           </w:p>
         </w:tc>
@@ -2739,7 +2739,7 @@
                 <w:color w:val="173B32"/>
                 <w:sz w:val="19"/>
               </w:rPr>
-              <w:t>Pazarlama kullanımı</w:t>
+              <w:t>Uygulama ve yayımlanan vaka sonucu</w:t>
             </w:r>
           </w:p>
         </w:tc>
@@ -2790,7 +2790,7 @@
                 <w:color w:val="000000"/>
                 <w:sz w:val="18"/>
               </w:rPr>
-              <w:t>Salesforce Einstein Lead Scoring</w:t>
+              <w:t>Salesforce / Grammarly</w:t>
             </w:r>
           </w:p>
         </w:tc>
@@ -2809,7 +2809,7 @@
                 <w:color w:val="000000"/>
                 <w:sz w:val="18"/>
               </w:rPr>
-              <w:t>Geçmiş dönüşüm örüntüleriyle adayları önceliklendirir ve etkili alanları CRM'de gösterir</w:t>
+              <w:t>Account Engagement ve Einstein puanlaması satışa hazır adayları önceliklendirir. Salesforce müşteri hikâyesinde Grammarly, MQL dönüşümünde %30 artış ve satış döngüsünün 60–90 günden 30 güne kısaldığını bildirmiştir</w:t>
             </w:r>
           </w:p>
         </w:tc>
@@ -2828,7 +2828,7 @@
                 <w:color w:val="000000"/>
                 <w:sz w:val="18"/>
               </w:rPr>
-              <w:t>Puan açıklamayla iş akışında olmalıdır; sağlayıcı yeteneği GrowthPilot sonucu değildir</w:t>
+              <w:t>Puan açıklamayla iş akışında olmalıdır; sonuç, sağlayıcının yayımladığı tek müşteri vakasıdır ve GrowthPilot kanıtı değildir</w:t>
             </w:r>
           </w:p>
         </w:tc>
@@ -2852,7 +2852,7 @@
                 <w:color w:val="000000"/>
                 <w:sz w:val="18"/>
               </w:rPr>
-              <w:t>Google Ads Smart Bidding</w:t>
+              <w:t>Google Ads / Aritaum</w:t>
             </w:r>
           </w:p>
         </w:tc>
@@ -2871,7 +2871,7 @@
                 <w:color w:val="000000"/>
                 <w:sz w:val="18"/>
               </w:rPr>
-              <w:t>Dönüşüm/değer için açık artırma anında Google AI kullanır; ölçüme dayanır</w:t>
+              <w:t>Aritaum'un Kore'deki 30 günlük deneyinde aynı ürün akışıyla Smart Shopping'in dönüşüm değeri optimizasyonu standart eCPC kampanyasıyla karşılaştırılmıştır. Think with Google vakası 2,2 kat ROAS ve %400 daha fazla dönüşüm bildirmiştir</w:t>
             </w:r>
           </w:p>
         </w:tc>
@@ -2890,7 +2890,7 @@
                 <w:color w:val="000000"/>
                 <w:sz w:val="18"/>
               </w:rPr>
-              <w:t>Optimizasyon ölçüm ve sağlayıcı verisine bağlıdır; yürütme karar yönetişiminden ayrılmalıdır</w:t>
+              <w:t>Optimizasyon ölçüm ve sağlayıcı verisine bağlıdır; yayımlanan vaka bağımsız doğrulama veya GrowthPilot sonucu değildir</w:t>
             </w:r>
           </w:p>
         </w:tc>
@@ -2903,7 +2903,7 @@
     </w:p>
     <w:p>
       <w:r>
-        <w:t>Dış kaynak yetenek örnekleridir; sağlayıcı performansı veya GrowthPilot iş sonucu iddia edilmez.</w:t>
+        <w:t>Rakamlar sağlayıcıların yayımladığı dış kaynak müşteri/vaka anlatılarıdır; bağımsız olarak yeniden üretilmiş sonuçlar, genellenebilir etki tahminleri veya GrowthPilot iş sonucu değildir.</w:t>
       </w:r>
     </w:p>
     <w:p>
@@ -3017,7 +3017,17 @@
     </w:p>
     <w:p>
       <w:r>
+        <w:t>Salesforce. (t.y.). Grammarly increases plan upgrades by 80% with sales and marketing AI. https://www.salesforce.com/customer-stories/grammarly-lead-scoring-ai/. Erişim: 13 Eylül 2026.</w:t>
+      </w:r>
+    </w:p>
+    <w:p>
+      <w:r>
         <w:t>Google Ads Help. (t.y.). About Smart Bidding. https://support.google.com/google-ads/answer/7065882?hl=en. Erişim: 11 Eylül 2026.</w:t>
+      </w:r>
+    </w:p>
+    <w:p>
+      <w:r>
+        <w:t>Think with Google. (t.y.). Experiment: How Aritaum lifted conversions with Smart Shopping campaigns. https://www.thinkwithgoogle.com/_qs/documents/11638/Experiment_-_How_Aritaum_lifted_conversions_with_Smart_Shopping_campaigns.pdf. Erişim: 13 Eylül 2026.</w:t>
       </w:r>
     </w:p>
     <w:p>

</xml_diff>